<commit_message>
Completed chapters 1-2-3 and now working on chap 4
</commit_message>
<xml_diff>
--- a/lic.docx
+++ b/lic.docx
@@ -613,7 +613,7 @@
           <w:r>
             <w:fldChar w:fldCharType="separate"/>
           </w:r>
-          <w:hyperlink w:anchor="_Toc223943442" w:history="1">
+          <w:hyperlink w:anchor="_Toc223944564" w:history="1">
             <w:r>
               <w:rPr>
                 <w:rStyle w:val="Hyperlink"/>
@@ -643,7 +643,7 @@
                 <w:noProof/>
                 <w:webHidden/>
               </w:rPr>
-              <w:instrText xml:space="preserve"> PAGEREF _Toc223943442 \h </w:instrText>
+              <w:instrText xml:space="preserve"> PAGEREF _Toc223944564 \h </w:instrText>
             </w:r>
             <w:r>
               <w:rPr>
@@ -688,7 +688,7 @@
               <w:lang w:val="en-US"/>
             </w:rPr>
           </w:pPr>
-          <w:hyperlink w:anchor="_Toc223943443" w:history="1">
+          <w:hyperlink w:anchor="_Toc223944565" w:history="1">
             <w:r>
               <w:rPr>
                 <w:rStyle w:val="Hyperlink"/>
@@ -718,7 +718,7 @@
                 <w:noProof/>
                 <w:webHidden/>
               </w:rPr>
-              <w:instrText xml:space="preserve"> PAGEREF _Toc223943443 \h </w:instrText>
+              <w:instrText xml:space="preserve"> PAGEREF _Toc223944565 \h </w:instrText>
             </w:r>
             <w:r>
               <w:rPr>
@@ -765,7 +765,7 @@
               <w14:ligatures w14:val="standardContextual"/>
             </w:rPr>
           </w:pPr>
-          <w:hyperlink w:anchor="_Toc223943444" w:history="1">
+          <w:hyperlink w:anchor="_Toc223944566" w:history="1">
             <w:r>
               <w:rPr>
                 <w:rStyle w:val="Hyperlink"/>
@@ -795,7 +795,7 @@
                 <w:noProof/>
                 <w:webHidden/>
               </w:rPr>
-              <w:instrText xml:space="preserve"> PAGEREF _Toc223943444 \h </w:instrText>
+              <w:instrText xml:space="preserve"> PAGEREF _Toc223944566 \h </w:instrText>
             </w:r>
             <w:r>
               <w:rPr>
@@ -842,7 +842,7 @@
               <w14:ligatures w14:val="standardContextual"/>
             </w:rPr>
           </w:pPr>
-          <w:hyperlink w:anchor="_Toc223943445" w:history="1">
+          <w:hyperlink w:anchor="_Toc223944567" w:history="1">
             <w:r>
               <w:rPr>
                 <w:rStyle w:val="Hyperlink"/>
@@ -872,7 +872,7 @@
                 <w:noProof/>
                 <w:webHidden/>
               </w:rPr>
-              <w:instrText xml:space="preserve"> PAGEREF _Toc223943445 \h </w:instrText>
+              <w:instrText xml:space="preserve"> PAGEREF _Toc223944567 \h </w:instrText>
             </w:r>
             <w:r>
               <w:rPr>
@@ -917,7 +917,7 @@
               <w:lang w:val="en-US"/>
             </w:rPr>
           </w:pPr>
-          <w:hyperlink w:anchor="_Toc223943446" w:history="1">
+          <w:hyperlink w:anchor="_Toc223944568" w:history="1">
             <w:r>
               <w:rPr>
                 <w:rStyle w:val="Hyperlink"/>
@@ -947,7 +947,7 @@
                 <w:noProof/>
                 <w:webHidden/>
               </w:rPr>
-              <w:instrText xml:space="preserve"> PAGEREF _Toc223943446 \h </w:instrText>
+              <w:instrText xml:space="preserve"> PAGEREF _Toc223944568 \h </w:instrText>
             </w:r>
             <w:r>
               <w:rPr>
@@ -994,7 +994,7 @@
               <w14:ligatures w14:val="standardContextual"/>
             </w:rPr>
           </w:pPr>
-          <w:hyperlink w:anchor="_Toc223943447" w:history="1">
+          <w:hyperlink w:anchor="_Toc223944569" w:history="1">
             <w:r>
               <w:rPr>
                 <w:rStyle w:val="Hyperlink"/>
@@ -1024,7 +1024,7 @@
                 <w:noProof/>
                 <w:webHidden/>
               </w:rPr>
-              <w:instrText xml:space="preserve"> PAGEREF _Toc223943447 \h </w:instrText>
+              <w:instrText xml:space="preserve"> PAGEREF _Toc223944569 \h </w:instrText>
             </w:r>
             <w:r>
               <w:rPr>
@@ -1071,7 +1071,7 @@
               <w14:ligatures w14:val="standardContextual"/>
             </w:rPr>
           </w:pPr>
-          <w:hyperlink w:anchor="_Toc223943448" w:history="1">
+          <w:hyperlink w:anchor="_Toc223944570" w:history="1">
             <w:r>
               <w:rPr>
                 <w:rStyle w:val="Hyperlink"/>
@@ -1101,7 +1101,7 @@
                 <w:noProof/>
                 <w:webHidden/>
               </w:rPr>
-              <w:instrText xml:space="preserve"> PAGEREF _Toc223943448 \h </w:instrText>
+              <w:instrText xml:space="preserve"> PAGEREF _Toc223944570 \h </w:instrText>
             </w:r>
             <w:r>
               <w:rPr>
@@ -1146,7 +1146,7 @@
               <w:lang w:val="en-US"/>
             </w:rPr>
           </w:pPr>
-          <w:hyperlink w:anchor="_Toc223943449" w:history="1">
+          <w:hyperlink w:anchor="_Toc223944571" w:history="1">
             <w:r>
               <w:rPr>
                 <w:rStyle w:val="Hyperlink"/>
@@ -1176,7 +1176,7 @@
                 <w:noProof/>
                 <w:webHidden/>
               </w:rPr>
-              <w:instrText xml:space="preserve"> PAGEREF _Toc223943449 \h </w:instrText>
+              <w:instrText xml:space="preserve"> PAGEREF _Toc223944571 \h </w:instrText>
             </w:r>
             <w:r>
               <w:rPr>
@@ -1223,7 +1223,7 @@
               <w14:ligatures w14:val="standardContextual"/>
             </w:rPr>
           </w:pPr>
-          <w:hyperlink w:anchor="_Toc223943450" w:history="1">
+          <w:hyperlink w:anchor="_Toc223944572" w:history="1">
             <w:r>
               <w:rPr>
                 <w:rStyle w:val="Hyperlink"/>
@@ -1274,7 +1274,7 @@
                 <w:noProof/>
                 <w:webHidden/>
               </w:rPr>
-              <w:instrText xml:space="preserve"> PAGEREF _Toc223943450 \h </w:instrText>
+              <w:instrText xml:space="preserve"> PAGEREF _Toc223944572 \h </w:instrText>
             </w:r>
             <w:r>
               <w:rPr>
@@ -1321,7 +1321,7 @@
               <w14:ligatures w14:val="standardContextual"/>
             </w:rPr>
           </w:pPr>
-          <w:hyperlink w:anchor="_Toc223943451" w:history="1">
+          <w:hyperlink w:anchor="_Toc223944573" w:history="1">
             <w:r>
               <w:rPr>
                 <w:rStyle w:val="Hyperlink"/>
@@ -1351,7 +1351,7 @@
                 <w:noProof/>
                 <w:webHidden/>
               </w:rPr>
-              <w:instrText xml:space="preserve"> PAGEREF _Toc223943451 \h </w:instrText>
+              <w:instrText xml:space="preserve"> PAGEREF _Toc223944573 \h </w:instrText>
             </w:r>
             <w:r>
               <w:rPr>
@@ -1398,7 +1398,7 @@
               <w14:ligatures w14:val="standardContextual"/>
             </w:rPr>
           </w:pPr>
-          <w:hyperlink w:anchor="_Toc223943452" w:history="1">
+          <w:hyperlink w:anchor="_Toc223944574" w:history="1">
             <w:r>
               <w:rPr>
                 <w:rStyle w:val="Hyperlink"/>
@@ -1428,7 +1428,7 @@
                 <w:noProof/>
                 <w:webHidden/>
               </w:rPr>
-              <w:instrText xml:space="preserve"> PAGEREF _Toc223943452 \h </w:instrText>
+              <w:instrText xml:space="preserve"> PAGEREF _Toc223944574 \h </w:instrText>
             </w:r>
             <w:r>
               <w:rPr>
@@ -1473,7 +1473,7 @@
               <w:lang w:val="en-US"/>
             </w:rPr>
           </w:pPr>
-          <w:hyperlink w:anchor="_Toc223943453" w:history="1">
+          <w:hyperlink w:anchor="_Toc223944575" w:history="1">
             <w:r>
               <w:rPr>
                 <w:rStyle w:val="Hyperlink"/>
@@ -1503,7 +1503,7 @@
                 <w:noProof/>
                 <w:webHidden/>
               </w:rPr>
-              <w:instrText xml:space="preserve"> PAGEREF _Toc223943453 \h </w:instrText>
+              <w:instrText xml:space="preserve"> PAGEREF _Toc223944575 \h </w:instrText>
             </w:r>
             <w:r>
               <w:rPr>
@@ -1550,7 +1550,7 @@
               <w14:ligatures w14:val="standardContextual"/>
             </w:rPr>
           </w:pPr>
-          <w:hyperlink w:anchor="_Toc223943454" w:history="1">
+          <w:hyperlink w:anchor="_Toc223944576" w:history="1">
             <w:r>
               <w:rPr>
                 <w:rStyle w:val="Hyperlink"/>
@@ -1580,7 +1580,7 @@
                 <w:noProof/>
                 <w:webHidden/>
               </w:rPr>
-              <w:instrText xml:space="preserve"> PAGEREF _Toc223943454 \h </w:instrText>
+              <w:instrText xml:space="preserve"> PAGEREF _Toc223944576 \h </w:instrText>
             </w:r>
             <w:r>
               <w:rPr>
@@ -1627,7 +1627,7 @@
               <w14:ligatures w14:val="standardContextual"/>
             </w:rPr>
           </w:pPr>
-          <w:hyperlink w:anchor="_Toc223943455" w:history="1">
+          <w:hyperlink w:anchor="_Toc223944577" w:history="1">
             <w:r>
               <w:rPr>
                 <w:rStyle w:val="Hyperlink"/>
@@ -1657,7 +1657,7 @@
                 <w:noProof/>
                 <w:webHidden/>
               </w:rPr>
-              <w:instrText xml:space="preserve"> PAGEREF _Toc223943455 \h </w:instrText>
+              <w:instrText xml:space="preserve"> PAGEREF _Toc223944577 \h </w:instrText>
             </w:r>
             <w:r>
               <w:rPr>
@@ -1704,7 +1704,7 @@
               <w14:ligatures w14:val="standardContextual"/>
             </w:rPr>
           </w:pPr>
-          <w:hyperlink w:anchor="_Toc223943456" w:history="1">
+          <w:hyperlink w:anchor="_Toc223944578" w:history="1">
             <w:r>
               <w:rPr>
                 <w:rStyle w:val="Hyperlink"/>
@@ -1734,7 +1734,7 @@
                 <w:noProof/>
                 <w:webHidden/>
               </w:rPr>
-              <w:instrText xml:space="preserve"> PAGEREF _Toc223943456 \h </w:instrText>
+              <w:instrText xml:space="preserve"> PAGEREF _Toc223944578 \h </w:instrText>
             </w:r>
             <w:r>
               <w:rPr>
@@ -1779,7 +1779,7 @@
               <w:lang w:val="en-US"/>
             </w:rPr>
           </w:pPr>
-          <w:hyperlink w:anchor="_Toc223943457" w:history="1">
+          <w:hyperlink w:anchor="_Toc223944579" w:history="1">
             <w:r>
               <w:rPr>
                 <w:rStyle w:val="Hyperlink"/>
@@ -1809,7 +1809,7 @@
                 <w:noProof/>
                 <w:webHidden/>
               </w:rPr>
-              <w:instrText xml:space="preserve"> PAGEREF _Toc223943457 \h </w:instrText>
+              <w:instrText xml:space="preserve"> PAGEREF _Toc223944579 \h </w:instrText>
             </w:r>
             <w:r>
               <w:rPr>
@@ -1854,7 +1854,7 @@
               <w:lang w:val="en-US"/>
             </w:rPr>
           </w:pPr>
-          <w:hyperlink w:anchor="_Toc223943458" w:history="1">
+          <w:hyperlink w:anchor="_Toc223944580" w:history="1">
             <w:r>
               <w:rPr>
                 <w:rStyle w:val="Hyperlink"/>
@@ -1884,7 +1884,7 @@
                 <w:noProof/>
                 <w:webHidden/>
               </w:rPr>
-              <w:instrText xml:space="preserve"> PAGEREF _Toc223943458 \h </w:instrText>
+              <w:instrText xml:space="preserve"> PAGEREF _Toc223944580 \h </w:instrText>
             </w:r>
             <w:r>
               <w:rPr>
@@ -1931,7 +1931,7 @@
               <w14:ligatures w14:val="standardContextual"/>
             </w:rPr>
           </w:pPr>
-          <w:hyperlink w:anchor="_Toc223943459" w:history="1">
+          <w:hyperlink w:anchor="_Toc223944581" w:history="1">
             <w:r>
               <w:rPr>
                 <w:rStyle w:val="Hyperlink"/>
@@ -1961,7 +1961,7 @@
                 <w:noProof/>
                 <w:webHidden/>
               </w:rPr>
-              <w:instrText xml:space="preserve"> PAGEREF _Toc223943459 \h </w:instrText>
+              <w:instrText xml:space="preserve"> PAGEREF _Toc223944581 \h </w:instrText>
             </w:r>
             <w:r>
               <w:rPr>
@@ -2008,7 +2008,7 @@
               <w14:ligatures w14:val="standardContextual"/>
             </w:rPr>
           </w:pPr>
-          <w:hyperlink w:anchor="_Toc223943460" w:history="1">
+          <w:hyperlink w:anchor="_Toc223944582" w:history="1">
             <w:r>
               <w:rPr>
                 <w:rStyle w:val="Hyperlink"/>
@@ -2038,7 +2038,7 @@
                 <w:noProof/>
                 <w:webHidden/>
               </w:rPr>
-              <w:instrText xml:space="preserve"> PAGEREF _Toc223943460 \h </w:instrText>
+              <w:instrText xml:space="preserve"> PAGEREF _Toc223944582 \h </w:instrText>
             </w:r>
             <w:r>
               <w:rPr>
@@ -2085,7 +2085,7 @@
               <w14:ligatures w14:val="standardContextual"/>
             </w:rPr>
           </w:pPr>
-          <w:hyperlink w:anchor="_Toc223943461" w:history="1">
+          <w:hyperlink w:anchor="_Toc223944583" w:history="1">
             <w:r>
               <w:rPr>
                 <w:rStyle w:val="Hyperlink"/>
@@ -2115,7 +2115,7 @@
                 <w:noProof/>
                 <w:webHidden/>
               </w:rPr>
-              <w:instrText xml:space="preserve"> PAGEREF _Toc223943461 \h </w:instrText>
+              <w:instrText xml:space="preserve"> PAGEREF _Toc223944583 \h </w:instrText>
             </w:r>
             <w:r>
               <w:rPr>
@@ -2162,7 +2162,7 @@
               <w14:ligatures w14:val="standardContextual"/>
             </w:rPr>
           </w:pPr>
-          <w:hyperlink w:anchor="_Toc223943462" w:history="1">
+          <w:hyperlink w:anchor="_Toc223944584" w:history="1">
             <w:r>
               <w:rPr>
                 <w:rStyle w:val="Hyperlink"/>
@@ -2193,7 +2193,7 @@
                 <w:noProof/>
                 <w:webHidden/>
               </w:rPr>
-              <w:instrText xml:space="preserve"> PAGEREF _Toc223943462 \h </w:instrText>
+              <w:instrText xml:space="preserve"> PAGEREF _Toc223944584 \h </w:instrText>
             </w:r>
             <w:r>
               <w:rPr>
@@ -2240,7 +2240,7 @@
               <w14:ligatures w14:val="standardContextual"/>
             </w:rPr>
           </w:pPr>
-          <w:hyperlink w:anchor="_Toc223943463" w:history="1">
+          <w:hyperlink w:anchor="_Toc223944585" w:history="1">
             <w:r>
               <w:rPr>
                 <w:rStyle w:val="Hyperlink"/>
@@ -2291,7 +2291,7 @@
                 <w:noProof/>
                 <w:webHidden/>
               </w:rPr>
-              <w:instrText xml:space="preserve"> PAGEREF _Toc223943463 \h </w:instrText>
+              <w:instrText xml:space="preserve"> PAGEREF _Toc223944585 \h </w:instrText>
             </w:r>
             <w:r>
               <w:rPr>
@@ -2336,7 +2336,7 @@
               <w:lang w:val="en-US"/>
             </w:rPr>
           </w:pPr>
-          <w:hyperlink w:anchor="_Toc223943464" w:history="1">
+          <w:hyperlink w:anchor="_Toc223944586" w:history="1">
             <w:r>
               <w:rPr>
                 <w:rStyle w:val="Hyperlink"/>
@@ -2377,7 +2377,7 @@
                 <w:noProof/>
                 <w:webHidden/>
               </w:rPr>
-              <w:instrText xml:space="preserve"> PAGEREF _Toc223943464 \h </w:instrText>
+              <w:instrText xml:space="preserve"> PAGEREF _Toc223944586 \h </w:instrText>
             </w:r>
             <w:r>
               <w:rPr>
@@ -2424,7 +2424,7 @@
               <w14:ligatures w14:val="standardContextual"/>
             </w:rPr>
           </w:pPr>
-          <w:hyperlink w:anchor="_Toc223943465" w:history="1">
+          <w:hyperlink w:anchor="_Toc223944587" w:history="1">
             <w:r>
               <w:rPr>
                 <w:rStyle w:val="Hyperlink"/>
@@ -2454,7 +2454,7 @@
                 <w:noProof/>
                 <w:webHidden/>
               </w:rPr>
-              <w:instrText xml:space="preserve"> PAGEREF _Toc223943465 \h </w:instrText>
+              <w:instrText xml:space="preserve"> PAGEREF _Toc223944587 \h </w:instrText>
             </w:r>
             <w:r>
               <w:rPr>
@@ -2501,7 +2501,7 @@
               <w14:ligatures w14:val="standardContextual"/>
             </w:rPr>
           </w:pPr>
-          <w:hyperlink w:anchor="_Toc223943466" w:history="1">
+          <w:hyperlink w:anchor="_Toc223944588" w:history="1">
             <w:r>
               <w:rPr>
                 <w:rStyle w:val="Hyperlink"/>
@@ -2531,7 +2531,7 @@
                 <w:noProof/>
                 <w:webHidden/>
               </w:rPr>
-              <w:instrText xml:space="preserve"> PAGEREF _Toc223943466 \h </w:instrText>
+              <w:instrText xml:space="preserve"> PAGEREF _Toc223944588 \h </w:instrText>
             </w:r>
             <w:r>
               <w:rPr>
@@ -2576,7 +2576,7 @@
               <w:lang w:val="en-US"/>
             </w:rPr>
           </w:pPr>
-          <w:hyperlink w:anchor="_Toc223943467" w:history="1">
+          <w:hyperlink w:anchor="_Toc223944589" w:history="1">
             <w:r>
               <w:rPr>
                 <w:rStyle w:val="Hyperlink"/>
@@ -2606,7 +2606,7 @@
                 <w:noProof/>
                 <w:webHidden/>
               </w:rPr>
-              <w:instrText xml:space="preserve"> PAGEREF _Toc223943467 \h </w:instrText>
+              <w:instrText xml:space="preserve"> PAGEREF _Toc223944589 \h </w:instrText>
             </w:r>
             <w:r>
               <w:rPr>
@@ -2651,7 +2651,7 @@
               <w:lang w:val="en-US"/>
             </w:rPr>
           </w:pPr>
-          <w:hyperlink w:anchor="_Toc223943468" w:history="1">
+          <w:hyperlink w:anchor="_Toc223944590" w:history="1">
             <w:r>
               <w:rPr>
                 <w:rStyle w:val="Hyperlink"/>
@@ -2681,7 +2681,7 @@
                 <w:noProof/>
                 <w:webHidden/>
               </w:rPr>
-              <w:instrText xml:space="preserve"> PAGEREF _Toc223943468 \h </w:instrText>
+              <w:instrText xml:space="preserve"> PAGEREF _Toc223944590 \h </w:instrText>
             </w:r>
             <w:r>
               <w:rPr>
@@ -2726,7 +2726,7 @@
               <w:lang w:val="en-US"/>
             </w:rPr>
           </w:pPr>
-          <w:hyperlink w:anchor="_Toc223943469" w:history="1">
+          <w:hyperlink w:anchor="_Toc223944591" w:history="1">
             <w:r>
               <w:rPr>
                 <w:rStyle w:val="Hyperlink"/>
@@ -2756,7 +2756,7 @@
                 <w:noProof/>
                 <w:webHidden/>
               </w:rPr>
-              <w:instrText xml:space="preserve"> PAGEREF _Toc223943469 \h </w:instrText>
+              <w:instrText xml:space="preserve"> PAGEREF _Toc223944591 \h </w:instrText>
             </w:r>
             <w:r>
               <w:rPr>
@@ -2850,7 +2850,7 @@
         <w:pStyle w:val="Heading1"/>
         <w:spacing w:before="0" w:after="0" w:line="312" w:lineRule="auto"/>
       </w:pPr>
-      <w:bookmarkStart w:id="1" w:name="_Toc223943442"/>
+      <w:bookmarkStart w:id="1" w:name="_Toc223944564"/>
       <w:r>
         <w:rPr>
           <w:rFonts w:ascii="Times New Roman" w:hAnsi="Times New Roman" w:cs="Times New Roman"/>
@@ -8766,7 +8766,7 @@
         </w:rPr>
       </w:pPr>
       <w:bookmarkStart w:id="2" w:name="_Toc13091"/>
-      <w:bookmarkStart w:id="3" w:name="_Toc223943443"/>
+      <w:bookmarkStart w:id="3" w:name="_Toc223944565"/>
       <w:r>
         <w:rPr>
           <w:rFonts w:ascii="Times New Roman" w:hAnsi="Times New Roman" w:cs="Times New Roman"/>
@@ -8916,7 +8916,7 @@
           <w:szCs w:val="28"/>
         </w:rPr>
       </w:pPr>
-      <w:bookmarkStart w:id="4" w:name="_Toc223943444"/>
+      <w:bookmarkStart w:id="4" w:name="_Toc223944566"/>
       <w:r>
         <w:rPr>
           <w:rFonts w:ascii="Times New Roman" w:hAnsi="Times New Roman" w:cs="Times New Roman"/>
@@ -12424,7 +12424,7 @@
           <w:szCs w:val="28"/>
         </w:rPr>
       </w:pPr>
-      <w:bookmarkStart w:id="5" w:name="_Toc223943445"/>
+      <w:bookmarkStart w:id="5" w:name="_Toc223944567"/>
       <w:r>
         <w:rPr>
           <w:rFonts w:ascii="Times New Roman" w:hAnsi="Times New Roman" w:cs="Times New Roman"/>
@@ -15794,7 +15794,7 @@
           <w:szCs w:val="36"/>
         </w:rPr>
       </w:pPr>
-      <w:bookmarkStart w:id="6" w:name="_Toc223943446"/>
+      <w:bookmarkStart w:id="6" w:name="_Toc223944568"/>
       <w:r>
         <w:rPr>
           <w:rFonts w:ascii="Times New Roman" w:hAnsi="Times New Roman" w:cs="Times New Roman"/>
@@ -15850,7 +15850,7 @@
           <w:szCs w:val="28"/>
         </w:rPr>
       </w:pPr>
-      <w:bookmarkStart w:id="7" w:name="_Toc223943447"/>
+      <w:bookmarkStart w:id="7" w:name="_Toc223944569"/>
       <w:r>
         <w:rPr>
           <w:rFonts w:ascii="Times New Roman" w:hAnsi="Times New Roman" w:cs="Times New Roman"/>
@@ -21775,7 +21775,7 @@
           <w:szCs w:val="28"/>
         </w:rPr>
       </w:pPr>
-      <w:bookmarkStart w:id="8" w:name="_Toc223943448"/>
+      <w:bookmarkStart w:id="8" w:name="_Toc223944570"/>
       <w:r>
         <w:rPr>
           <w:rFonts w:ascii="Times New Roman" w:hAnsi="Times New Roman" w:cs="Times New Roman"/>
@@ -29205,7 +29205,7 @@
           <w:szCs w:val="36"/>
         </w:rPr>
       </w:pPr>
-      <w:bookmarkStart w:id="9" w:name="_Toc223943449"/>
+      <w:bookmarkStart w:id="9" w:name="_Toc223944571"/>
       <w:r>
         <w:rPr>
           <w:rFonts w:ascii="Times New Roman" w:hAnsi="Times New Roman" w:cs="Times New Roman"/>
@@ -29273,7 +29273,7 @@
           <w:szCs w:val="28"/>
         </w:rPr>
       </w:pPr>
-      <w:bookmarkStart w:id="10" w:name="_Toc223943450"/>
+      <w:bookmarkStart w:id="10" w:name="_Toc223944572"/>
       <w:r>
         <w:rPr>
           <w:rFonts w:ascii="Times New Roman" w:hAnsi="Times New Roman" w:cs="Times New Roman"/>
@@ -36811,7 +36811,9 @@
           <w:szCs w:val="28"/>
         </w:rPr>
       </w:pPr>
-      <w:bookmarkStart w:id="11" w:name="_Toc223943451"/>
+      <w:bookmarkStart w:id="11" w:name="_Ref223944058"/>
+      <w:bookmarkStart w:id="12" w:name="_Ref223944065"/>
+      <w:bookmarkStart w:id="13" w:name="_Toc223944573"/>
       <w:r>
         <w:rPr>
           <w:rFonts w:ascii="Times New Roman" w:hAnsi="Times New Roman" w:cs="Times New Roman"/>
@@ -36865,6 +36867,8 @@
         <w:t>-uri</w:t>
       </w:r>
       <w:bookmarkEnd w:id="11"/>
+      <w:bookmarkEnd w:id="12"/>
+      <w:bookmarkEnd w:id="13"/>
     </w:p>
     <w:p>
       <w:pPr>
@@ -40998,7 +41002,10 @@
           <w:szCs w:val="28"/>
         </w:rPr>
       </w:pPr>
-      <w:bookmarkStart w:id="12" w:name="_Toc223943452"/>
+      <w:bookmarkStart w:id="14" w:name="_Ref223943834"/>
+      <w:bookmarkStart w:id="15" w:name="_Ref223943842"/>
+      <w:bookmarkStart w:id="16" w:name="_Ref223943844"/>
+      <w:bookmarkStart w:id="17" w:name="_Toc223944574"/>
       <w:r>
         <w:rPr>
           <w:rFonts w:ascii="Times New Roman" w:hAnsi="Times New Roman" w:cs="Times New Roman"/>
@@ -41029,7 +41036,10 @@
         </w:rPr>
         <w:t xml:space="preserve"> Gestionarea cererilor HTTP</w:t>
       </w:r>
-      <w:bookmarkEnd w:id="12"/>
+      <w:bookmarkEnd w:id="14"/>
+      <w:bookmarkEnd w:id="15"/>
+      <w:bookmarkEnd w:id="16"/>
+      <w:bookmarkEnd w:id="17"/>
     </w:p>
     <w:p>
       <w:pPr>
@@ -45293,7 +45303,7 @@
           <w:szCs w:val="36"/>
         </w:rPr>
       </w:pPr>
-      <w:bookmarkStart w:id="13" w:name="_Toc223943453"/>
+      <w:bookmarkStart w:id="18" w:name="_Toc223944575"/>
       <w:r>
         <w:rPr>
           <w:rFonts w:ascii="Times New Roman" w:hAnsi="Times New Roman" w:cs="Times New Roman"/>
@@ -45315,7 +45325,7 @@
         </w:rPr>
         <w:t>Proiectarea sistemului mâinii robotice</w:t>
       </w:r>
-      <w:bookmarkEnd w:id="13"/>
+      <w:bookmarkEnd w:id="18"/>
     </w:p>
     <w:p>
       <w:pPr>
@@ -47025,7 +47035,7 @@
           <w:szCs w:val="28"/>
         </w:rPr>
       </w:pPr>
-      <w:bookmarkStart w:id="14" w:name="_Toc223943454"/>
+      <w:bookmarkStart w:id="19" w:name="_Toc223944576"/>
       <w:r>
         <w:rPr>
           <w:rFonts w:ascii="Times New Roman" w:hAnsi="Times New Roman" w:cs="Times New Roman"/>
@@ -47036,7 +47046,7 @@
         </w:rPr>
         <w:t>4.1. Cerințe funcționale</w:t>
       </w:r>
-      <w:bookmarkEnd w:id="14"/>
+      <w:bookmarkEnd w:id="19"/>
       <w:r>
         <w:rPr>
           <w:rFonts w:ascii="Times New Roman" w:hAnsi="Times New Roman" w:cs="Times New Roman"/>
@@ -47063,7 +47073,7 @@
           <w:rFonts w:ascii="Times New Roman" w:hAnsi="Times New Roman" w:cs="Times New Roman"/>
           <w:sz w:val="24"/>
         </w:rPr>
-        <w:t xml:space="preserve">Cerințele funcționale stabilesc parametrii operaționali ai sistemului, vizând controlul determinist și de înaltă precizie al structurii robotice. Sistemul este proiectat pentru a permite gestionarea independentă a fiecărui deget prin intermediul unor servomotoare dedicate, impunând o rezoluție unghiulară minimă de 1° pentru a facilita execuția unor mișcări fine. Performanța în timp real este esențială, arhitectura fiind optimizată pentru a minimiza latențele și a menține sincronizarea inter-digitală în timpul gesturilor complexe. Componenta de interfațare (HMI) asigură o experiență intuitivă și </w:t>
+        <w:t xml:space="preserve">Cerințele funcționale stabilesc parametrii operaționali ai sistemului, vizând controlul determinist și de înaltă precizie al structurii robotice. Sistemul este proiectat pentru a permite gestionarea independentă a fiecărui deget prin intermediul unor servomotoare dedicate, impunând o rezoluție unghiulară minimă de 1° pentru a facilita execuția unor mișcări fine. Performanța în timp real este esențială, arhitectura fiind optimizată pentru a minimiza latențele și a menține sincronizarea inter-digitală în timpul gesturilor complexe. Componenta de interfațare asigură o experiență intuitivă și </w:t>
       </w:r>
       <w:proofErr w:type="spellStart"/>
       <w:r>
@@ -47079,33 +47089,77 @@
           <w:rFonts w:ascii="Times New Roman" w:hAnsi="Times New Roman" w:cs="Times New Roman"/>
           <w:sz w:val="24"/>
         </w:rPr>
-        <w:t xml:space="preserve">, permițând monitorizarea și configurarea stării </w:t>
-      </w:r>
-      <w:proofErr w:type="spellStart"/>
-      <w:r>
-        <w:rPr>
-          <w:rFonts w:ascii="Times New Roman" w:hAnsi="Times New Roman" w:cs="Times New Roman"/>
-          <w:sz w:val="24"/>
-        </w:rPr>
-        <w:t>actuatoarelor</w:t>
-      </w:r>
-      <w:proofErr w:type="spellEnd"/>
-      <w:r>
-        <w:rPr>
-          <w:rFonts w:ascii="Times New Roman" w:hAnsi="Times New Roman" w:cs="Times New Roman"/>
-          <w:sz w:val="24"/>
-        </w:rPr>
-        <w:t xml:space="preserve"> în timp real prin protocoale de comunicație de înaltă eficiență, precum HTTP sau </w:t>
-      </w:r>
-      <w:proofErr w:type="spellStart"/>
-      <w:r>
-        <w:rPr>
-          <w:rFonts w:ascii="Times New Roman" w:hAnsi="Times New Roman" w:cs="Times New Roman"/>
-          <w:sz w:val="24"/>
-        </w:rPr>
-        <w:t>WebSocket</w:t>
-      </w:r>
-      <w:proofErr w:type="spellEnd"/>
+        <w:t>, permițând monitorizarea și configurarea stării în timp real prin protocoale de comunicație de înaltă eficiență</w:t>
+      </w:r>
+      <w:r>
+        <w:rPr>
+          <w:rFonts w:ascii="Times New Roman" w:hAnsi="Times New Roman" w:cs="Times New Roman"/>
+          <w:sz w:val="24"/>
+        </w:rPr>
+        <w:t xml:space="preserve"> </w:t>
+      </w:r>
+      <w:r>
+        <w:rPr>
+          <w:rFonts w:ascii="Times New Roman" w:hAnsi="Times New Roman" w:cs="Times New Roman"/>
+          <w:sz w:val="24"/>
+        </w:rPr>
+        <w:t>[</w:t>
+      </w:r>
+      <w:r>
+        <w:rPr>
+          <w:rFonts w:ascii="Times New Roman" w:hAnsi="Times New Roman" w:cs="Times New Roman"/>
+          <w:sz w:val="24"/>
+        </w:rPr>
+        <w:fldChar w:fldCharType="begin"/>
+      </w:r>
+      <w:r>
+        <w:rPr>
+          <w:rFonts w:ascii="Times New Roman" w:hAnsi="Times New Roman" w:cs="Times New Roman"/>
+          <w:sz w:val="24"/>
+        </w:rPr>
+        <w:instrText xml:space="preserve"> REF _Ref223943834 \h </w:instrText>
+      </w:r>
+      <w:r>
+        <w:rPr>
+          <w:rFonts w:ascii="Times New Roman" w:hAnsi="Times New Roman" w:cs="Times New Roman"/>
+          <w:sz w:val="24"/>
+        </w:rPr>
+      </w:r>
+      <w:r>
+        <w:rPr>
+          <w:rFonts w:ascii="Times New Roman" w:hAnsi="Times New Roman" w:cs="Times New Roman"/>
+          <w:sz w:val="24"/>
+        </w:rPr>
+        <w:instrText xml:space="preserve"> \* MERGEFORMAT </w:instrText>
+      </w:r>
+      <w:r>
+        <w:rPr>
+          <w:rFonts w:ascii="Times New Roman" w:hAnsi="Times New Roman" w:cs="Times New Roman"/>
+          <w:sz w:val="24"/>
+        </w:rPr>
+        <w:fldChar w:fldCharType="separate"/>
+      </w:r>
+      <w:r>
+        <w:rPr>
+          <w:rFonts w:ascii="Times New Roman" w:hAnsi="Times New Roman" w:cs="Times New Roman"/>
+          <w:sz w:val="24"/>
+        </w:rPr>
+        <w:t>3.3. Gestionarea cererilor HTTP</w:t>
+      </w:r>
+      <w:r>
+        <w:rPr>
+          <w:rFonts w:ascii="Times New Roman" w:hAnsi="Times New Roman" w:cs="Times New Roman"/>
+          <w:sz w:val="24"/>
+        </w:rPr>
+        <w:fldChar w:fldCharType="end"/>
+      </w:r>
+      <w:r>
+        <w:rPr>
+          <w:rFonts w:ascii="Times New Roman" w:hAnsi="Times New Roman" w:cs="Times New Roman"/>
+          <w:sz w:val="24"/>
+        </w:rPr>
+        <w:t>]</w:t>
+      </w:r>
       <w:r>
         <w:rPr>
           <w:rFonts w:ascii="Times New Roman" w:hAnsi="Times New Roman" w:cs="Times New Roman"/>
@@ -47133,27 +47187,15 @@
           <w:lang w:val="en-US"/>
         </w:rPr>
       </w:pPr>
-    </w:p>
-    <w:p>
-      <w:pPr>
-        <w:spacing w:after="0" w:line="312" w:lineRule="auto"/>
-        <w:ind w:left="14" w:right="0" w:firstLine="850"/>
-        <w:jc w:val="center"/>
-        <w:rPr>
-          <w:rFonts w:ascii="Times New Roman" w:hAnsi="Times New Roman" w:cs="Times New Roman"/>
-          <w:sz w:val="24"/>
-          <w:lang w:val="en-US"/>
-        </w:rPr>
-      </w:pPr>
       <w:r>
         <w:rPr>
           <w:noProof/>
         </w:rPr>
         <w:drawing>
-          <wp:inline distT="0" distB="0" distL="0" distR="0" wp14:anchorId="3D8A9220" wp14:editId="11163475">
-            <wp:extent cx="4633125" cy="2059388"/>
-            <wp:effectExtent l="0" t="0" r="0" b="0"/>
-            <wp:docPr id="318768689" name="Picture 1"/>
+          <wp:inline distT="0" distB="0" distL="0" distR="0" wp14:anchorId="02323CE3" wp14:editId="3CF2BCCC">
+            <wp:extent cx="3866181" cy="1892411"/>
+            <wp:effectExtent l="0" t="0" r="1270" b="0"/>
+            <wp:docPr id="965474475" name="Picture 1"/>
             <wp:cNvGraphicFramePr>
               <a:graphicFrameLocks xmlns:a="http://schemas.openxmlformats.org/drawingml/2006/main" noChangeAspect="1"/>
             </wp:cNvGraphicFramePr>
@@ -47161,7 +47203,7 @@
               <a:graphicData uri="http://schemas.openxmlformats.org/drawingml/2006/picture">
                 <pic:pic xmlns:pic="http://schemas.openxmlformats.org/drawingml/2006/picture">
                   <pic:nvPicPr>
-                    <pic:cNvPr id="318768689" name=""/>
+                    <pic:cNvPr id="965474475" name=""/>
                     <pic:cNvPicPr/>
                   </pic:nvPicPr>
                   <pic:blipFill>
@@ -47173,7 +47215,7 @@
                   <pic:spPr>
                     <a:xfrm>
                       <a:off x="0" y="0"/>
-                      <a:ext cx="4685155" cy="2082515"/>
+                      <a:ext cx="3885451" cy="1901843"/>
                     </a:xfrm>
                     <a:prstGeom prst="rect">
                       <a:avLst/>
@@ -47217,15 +47259,15 @@
           <w:sz w:val="24"/>
           <w:lang w:val="en-US"/>
         </w:rPr>
-        <w:t xml:space="preserve"> 4.1</w:t>
-      </w:r>
-      <w:r>
-        <w:rPr>
-          <w:rFonts w:ascii="Times New Roman" w:hAnsi="Times New Roman" w:cs="Times New Roman"/>
-          <w:sz w:val="24"/>
-          <w:lang w:val="en-US"/>
-        </w:rPr>
-        <w:t xml:space="preserve">. </w:t>
+        <w:t xml:space="preserve"> 4.1.</w:t>
+      </w:r>
+      <w:r>
+        <w:rPr>
+          <w:rFonts w:ascii="Times New Roman" w:hAnsi="Times New Roman" w:cs="Times New Roman"/>
+          <w:sz w:val="24"/>
+          <w:lang w:val="en-US"/>
+        </w:rPr>
+        <w:t xml:space="preserve"> </w:t>
       </w:r>
       <w:proofErr w:type="spellStart"/>
       <w:r>
@@ -47243,50 +47285,14 @@
           <w:sz w:val="24"/>
           <w:lang w:val="en-US"/>
         </w:rPr>
-        <w:t xml:space="preserve"> de </w:t>
-      </w:r>
-      <w:proofErr w:type="spellStart"/>
-      <w:r>
-        <w:rPr>
-          <w:rFonts w:ascii="Times New Roman" w:hAnsi="Times New Roman" w:cs="Times New Roman"/>
-          <w:sz w:val="24"/>
-          <w:lang w:val="en-US"/>
-        </w:rPr>
-        <w:t>secven</w:t>
-      </w:r>
-      <w:proofErr w:type="spellEnd"/>
-      <w:r>
-        <w:rPr>
-          <w:rFonts w:ascii="Times New Roman" w:hAnsi="Times New Roman" w:cs="Times New Roman"/>
-          <w:sz w:val="24"/>
-        </w:rPr>
-        <w:t>ț</w:t>
-      </w:r>
-      <w:r>
-        <w:rPr>
-          <w:rFonts w:ascii="Times New Roman" w:hAnsi="Times New Roman" w:cs="Times New Roman"/>
-          <w:sz w:val="24"/>
-          <w:lang w:val="en-US"/>
-        </w:rPr>
-        <w:t xml:space="preserve">e a </w:t>
-      </w:r>
-      <w:proofErr w:type="spellStart"/>
-      <w:r>
-        <w:rPr>
-          <w:rFonts w:ascii="Times New Roman" w:hAnsi="Times New Roman" w:cs="Times New Roman"/>
-          <w:sz w:val="24"/>
-          <w:lang w:val="en-US"/>
-        </w:rPr>
-        <w:t>fluxului</w:t>
-      </w:r>
-      <w:proofErr w:type="spellEnd"/>
-      <w:r>
-        <w:rPr>
-          <w:rFonts w:ascii="Times New Roman" w:hAnsi="Times New Roman" w:cs="Times New Roman"/>
-          <w:sz w:val="24"/>
-          <w:lang w:val="en-US"/>
-        </w:rPr>
-        <w:t xml:space="preserve">  </w:t>
+        <w:t xml:space="preserve"> </w:t>
+      </w:r>
+      <w:r>
+        <w:rPr>
+          <w:rFonts w:ascii="Times New Roman" w:hAnsi="Times New Roman" w:cs="Times New Roman"/>
+          <w:sz w:val="24"/>
+        </w:rPr>
+        <w:t>de secvență a fluxului</w:t>
       </w:r>
     </w:p>
     <w:p>
@@ -47612,186 +47618,6 @@
           <w:sz w:val="24"/>
           <w:lang w:val="en-US"/>
         </w:rPr>
-        <w:t>transformată</w:t>
-      </w:r>
-      <w:proofErr w:type="spellEnd"/>
-      <w:r>
-        <w:rPr>
-          <w:rFonts w:ascii="Times New Roman" w:hAnsi="Times New Roman" w:cs="Times New Roman"/>
-          <w:sz w:val="24"/>
-          <w:lang w:val="en-US"/>
-        </w:rPr>
-        <w:t xml:space="preserve"> </w:t>
-      </w:r>
-      <w:proofErr w:type="spellStart"/>
-      <w:r>
-        <w:rPr>
-          <w:rFonts w:ascii="Times New Roman" w:hAnsi="Times New Roman" w:cs="Times New Roman"/>
-          <w:sz w:val="24"/>
-          <w:lang w:val="en-US"/>
-        </w:rPr>
-        <w:t>într</w:t>
-      </w:r>
-      <w:proofErr w:type="spellEnd"/>
-      <w:r>
-        <w:rPr>
-          <w:rFonts w:ascii="Times New Roman" w:hAnsi="Times New Roman" w:cs="Times New Roman"/>
-          <w:sz w:val="24"/>
-          <w:lang w:val="en-US"/>
-        </w:rPr>
-        <w:t xml:space="preserve">-un </w:t>
-      </w:r>
-      <w:proofErr w:type="spellStart"/>
-      <w:r>
-        <w:rPr>
-          <w:rFonts w:ascii="Times New Roman" w:hAnsi="Times New Roman" w:cs="Times New Roman"/>
-          <w:sz w:val="24"/>
-          <w:lang w:val="en-US"/>
-        </w:rPr>
-        <w:t>mesaj</w:t>
-      </w:r>
-      <w:proofErr w:type="spellEnd"/>
-      <w:r>
-        <w:rPr>
-          <w:rFonts w:ascii="Times New Roman" w:hAnsi="Times New Roman" w:cs="Times New Roman"/>
-          <w:sz w:val="24"/>
-          <w:lang w:val="en-US"/>
-        </w:rPr>
-        <w:t xml:space="preserve"> JSON care </w:t>
-      </w:r>
-      <w:proofErr w:type="spellStart"/>
-      <w:r>
-        <w:rPr>
-          <w:rFonts w:ascii="Times New Roman" w:hAnsi="Times New Roman" w:cs="Times New Roman"/>
-          <w:sz w:val="24"/>
-          <w:lang w:val="en-US"/>
-        </w:rPr>
-        <w:t>specifică</w:t>
-      </w:r>
-      <w:proofErr w:type="spellEnd"/>
-      <w:r>
-        <w:rPr>
-          <w:rFonts w:ascii="Times New Roman" w:hAnsi="Times New Roman" w:cs="Times New Roman"/>
-          <w:sz w:val="24"/>
-          <w:lang w:val="en-US"/>
-        </w:rPr>
-        <w:t xml:space="preserve"> </w:t>
-      </w:r>
-      <w:proofErr w:type="spellStart"/>
-      <w:r>
-        <w:rPr>
-          <w:rFonts w:ascii="Times New Roman" w:hAnsi="Times New Roman" w:cs="Times New Roman"/>
-          <w:sz w:val="24"/>
-          <w:lang w:val="en-US"/>
-        </w:rPr>
-        <w:t>degetul</w:t>
-      </w:r>
-      <w:proofErr w:type="spellEnd"/>
-      <w:r>
-        <w:rPr>
-          <w:rFonts w:ascii="Times New Roman" w:hAnsi="Times New Roman" w:cs="Times New Roman"/>
-          <w:sz w:val="24"/>
-          <w:lang w:val="en-US"/>
-        </w:rPr>
-        <w:t xml:space="preserve"> </w:t>
-      </w:r>
-      <w:proofErr w:type="spellStart"/>
-      <w:r>
-        <w:rPr>
-          <w:rFonts w:ascii="Times New Roman" w:hAnsi="Times New Roman" w:cs="Times New Roman"/>
-          <w:sz w:val="24"/>
-          <w:lang w:val="en-US"/>
-        </w:rPr>
-        <w:t>și</w:t>
-      </w:r>
-      <w:proofErr w:type="spellEnd"/>
-      <w:r>
-        <w:rPr>
-          <w:rFonts w:ascii="Times New Roman" w:hAnsi="Times New Roman" w:cs="Times New Roman"/>
-          <w:sz w:val="24"/>
-          <w:lang w:val="en-US"/>
-        </w:rPr>
-        <w:t xml:space="preserve"> </w:t>
-      </w:r>
-      <w:proofErr w:type="spellStart"/>
-      <w:r>
-        <w:rPr>
-          <w:rFonts w:ascii="Times New Roman" w:hAnsi="Times New Roman" w:cs="Times New Roman"/>
-          <w:sz w:val="24"/>
-          <w:lang w:val="en-US"/>
-        </w:rPr>
-        <w:t>unghiul</w:t>
-      </w:r>
-      <w:proofErr w:type="spellEnd"/>
-      <w:r>
-        <w:rPr>
-          <w:rFonts w:ascii="Times New Roman" w:hAnsi="Times New Roman" w:cs="Times New Roman"/>
-          <w:sz w:val="24"/>
-          <w:lang w:val="en-US"/>
-        </w:rPr>
-        <w:t xml:space="preserve"> </w:t>
-      </w:r>
-      <w:proofErr w:type="spellStart"/>
-      <w:r>
-        <w:rPr>
-          <w:rFonts w:ascii="Times New Roman" w:hAnsi="Times New Roman" w:cs="Times New Roman"/>
-          <w:sz w:val="24"/>
-          <w:lang w:val="en-US"/>
-        </w:rPr>
-        <w:t>dorit</w:t>
-      </w:r>
-      <w:proofErr w:type="spellEnd"/>
-      <w:r>
-        <w:rPr>
-          <w:rFonts w:ascii="Times New Roman" w:hAnsi="Times New Roman" w:cs="Times New Roman"/>
-          <w:sz w:val="24"/>
-          <w:lang w:val="en-US"/>
-        </w:rPr>
-        <w:t xml:space="preserve">. </w:t>
-      </w:r>
-      <w:proofErr w:type="spellStart"/>
-      <w:r>
-        <w:rPr>
-          <w:rFonts w:ascii="Times New Roman" w:hAnsi="Times New Roman" w:cs="Times New Roman"/>
-          <w:sz w:val="24"/>
-          <w:lang w:val="en-US"/>
-        </w:rPr>
-        <w:t>Acest</w:t>
-      </w:r>
-      <w:proofErr w:type="spellEnd"/>
-      <w:r>
-        <w:rPr>
-          <w:rFonts w:ascii="Times New Roman" w:hAnsi="Times New Roman" w:cs="Times New Roman"/>
-          <w:sz w:val="24"/>
-          <w:lang w:val="en-US"/>
-        </w:rPr>
-        <w:t xml:space="preserve"> </w:t>
-      </w:r>
-      <w:proofErr w:type="spellStart"/>
-      <w:r>
-        <w:rPr>
-          <w:rFonts w:ascii="Times New Roman" w:hAnsi="Times New Roman" w:cs="Times New Roman"/>
-          <w:sz w:val="24"/>
-          <w:lang w:val="en-US"/>
-        </w:rPr>
-        <w:t>mesaj</w:t>
-      </w:r>
-      <w:proofErr w:type="spellEnd"/>
-      <w:r>
-        <w:rPr>
-          <w:rFonts w:ascii="Times New Roman" w:hAnsi="Times New Roman" w:cs="Times New Roman"/>
-          <w:sz w:val="24"/>
-          <w:lang w:val="en-US"/>
-        </w:rPr>
-        <w:t xml:space="preserve"> </w:t>
-      </w:r>
-      <w:proofErr w:type="spellStart"/>
-      <w:r>
-        <w:rPr>
-          <w:rFonts w:ascii="Times New Roman" w:hAnsi="Times New Roman" w:cs="Times New Roman"/>
-          <w:sz w:val="24"/>
-          <w:lang w:val="en-US"/>
-        </w:rPr>
         <w:t>este</w:t>
       </w:r>
       <w:proofErr w:type="spellEnd"/>
@@ -47811,6 +47637,14 @@
           <w:lang w:val="en-US"/>
         </w:rPr>
         <w:t>trimis</w:t>
+      </w:r>
+      <w:r>
+        <w:rPr>
+          <w:rFonts w:ascii="Times New Roman" w:hAnsi="Times New Roman" w:cs="Times New Roman"/>
+          <w:sz w:val="24"/>
+          <w:lang w:val="en-US"/>
+        </w:rPr>
+        <w:t>ă</w:t>
       </w:r>
       <w:proofErr w:type="spellEnd"/>
       <w:r>
@@ -47865,601 +47699,601 @@
           <w:sz w:val="24"/>
           <w:lang w:val="en-US"/>
         </w:rPr>
+        <w:t>Unitatea</w:t>
+      </w:r>
+      <w:proofErr w:type="spellEnd"/>
+      <w:r>
+        <w:rPr>
+          <w:rFonts w:ascii="Times New Roman" w:hAnsi="Times New Roman" w:cs="Times New Roman"/>
+          <w:sz w:val="24"/>
+          <w:lang w:val="en-US"/>
+        </w:rPr>
+        <w:t xml:space="preserve"> </w:t>
+      </w:r>
+      <w:proofErr w:type="spellStart"/>
+      <w:r>
+        <w:rPr>
+          <w:rFonts w:ascii="Times New Roman" w:hAnsi="Times New Roman" w:cs="Times New Roman"/>
+          <w:sz w:val="24"/>
+          <w:lang w:val="en-US"/>
+        </w:rPr>
+        <w:t>centrală</w:t>
+      </w:r>
+      <w:proofErr w:type="spellEnd"/>
+      <w:r>
+        <w:rPr>
+          <w:rFonts w:ascii="Times New Roman" w:hAnsi="Times New Roman" w:cs="Times New Roman"/>
+          <w:sz w:val="24"/>
+          <w:lang w:val="en-US"/>
+        </w:rPr>
+        <w:t xml:space="preserve"> de </w:t>
+      </w:r>
+      <w:proofErr w:type="spellStart"/>
+      <w:r>
+        <w:rPr>
+          <w:rFonts w:ascii="Times New Roman" w:hAnsi="Times New Roman" w:cs="Times New Roman"/>
+          <w:sz w:val="24"/>
+          <w:lang w:val="en-US"/>
+        </w:rPr>
+        <w:t>procesare</w:t>
+      </w:r>
+      <w:proofErr w:type="spellEnd"/>
+      <w:r>
+        <w:rPr>
+          <w:rFonts w:ascii="Times New Roman" w:hAnsi="Times New Roman" w:cs="Times New Roman"/>
+          <w:sz w:val="24"/>
+          <w:lang w:val="en-US"/>
+        </w:rPr>
+        <w:t xml:space="preserve"> </w:t>
+      </w:r>
+      <w:proofErr w:type="spellStart"/>
+      <w:r>
+        <w:rPr>
+          <w:rFonts w:ascii="Times New Roman" w:hAnsi="Times New Roman" w:cs="Times New Roman"/>
+          <w:sz w:val="24"/>
+          <w:lang w:val="en-US"/>
+        </w:rPr>
+        <w:t>recepționează</w:t>
+      </w:r>
+      <w:proofErr w:type="spellEnd"/>
+      <w:r>
+        <w:rPr>
+          <w:rFonts w:ascii="Times New Roman" w:hAnsi="Times New Roman" w:cs="Times New Roman"/>
+          <w:sz w:val="24"/>
+          <w:lang w:val="en-US"/>
+        </w:rPr>
+        <w:t xml:space="preserve"> </w:t>
+      </w:r>
+      <w:proofErr w:type="spellStart"/>
+      <w:r>
+        <w:rPr>
+          <w:rFonts w:ascii="Times New Roman" w:hAnsi="Times New Roman" w:cs="Times New Roman"/>
+          <w:sz w:val="24"/>
+          <w:lang w:val="en-US"/>
+        </w:rPr>
+        <w:t>și</w:t>
+      </w:r>
+      <w:proofErr w:type="spellEnd"/>
+      <w:r>
+        <w:rPr>
+          <w:rFonts w:ascii="Times New Roman" w:hAnsi="Times New Roman" w:cs="Times New Roman"/>
+          <w:sz w:val="24"/>
+          <w:lang w:val="en-US"/>
+        </w:rPr>
+        <w:t xml:space="preserve"> </w:t>
+      </w:r>
+      <w:proofErr w:type="spellStart"/>
+      <w:r>
+        <w:rPr>
+          <w:rFonts w:ascii="Times New Roman" w:hAnsi="Times New Roman" w:cs="Times New Roman"/>
+          <w:sz w:val="24"/>
+          <w:lang w:val="en-US"/>
+        </w:rPr>
+        <w:t>decodează</w:t>
+      </w:r>
+      <w:proofErr w:type="spellEnd"/>
+      <w:r>
+        <w:rPr>
+          <w:rFonts w:ascii="Times New Roman" w:hAnsi="Times New Roman" w:cs="Times New Roman"/>
+          <w:sz w:val="24"/>
+          <w:lang w:val="en-US"/>
+        </w:rPr>
+        <w:t xml:space="preserve"> </w:t>
+      </w:r>
+      <w:proofErr w:type="spellStart"/>
+      <w:r>
+        <w:rPr>
+          <w:rFonts w:ascii="Times New Roman" w:hAnsi="Times New Roman" w:cs="Times New Roman"/>
+          <w:sz w:val="24"/>
+          <w:lang w:val="en-US"/>
+        </w:rPr>
+        <w:t>pachetele</w:t>
+      </w:r>
+      <w:proofErr w:type="spellEnd"/>
+      <w:r>
+        <w:rPr>
+          <w:rFonts w:ascii="Times New Roman" w:hAnsi="Times New Roman" w:cs="Times New Roman"/>
+          <w:sz w:val="24"/>
+          <w:lang w:val="en-US"/>
+        </w:rPr>
+        <w:t xml:space="preserve"> de date, </w:t>
+      </w:r>
+      <w:proofErr w:type="spellStart"/>
+      <w:r>
+        <w:rPr>
+          <w:rFonts w:ascii="Times New Roman" w:hAnsi="Times New Roman" w:cs="Times New Roman"/>
+          <w:sz w:val="24"/>
+          <w:lang w:val="en-US"/>
+        </w:rPr>
+        <w:t>calculând</w:t>
+      </w:r>
+      <w:proofErr w:type="spellEnd"/>
+      <w:r>
+        <w:rPr>
+          <w:rFonts w:ascii="Times New Roman" w:hAnsi="Times New Roman" w:cs="Times New Roman"/>
+          <w:sz w:val="24"/>
+          <w:lang w:val="en-US"/>
+        </w:rPr>
+        <w:t xml:space="preserve"> </w:t>
+      </w:r>
+      <w:proofErr w:type="spellStart"/>
+      <w:r>
+        <w:rPr>
+          <w:rFonts w:ascii="Times New Roman" w:hAnsi="Times New Roman" w:cs="Times New Roman"/>
+          <w:sz w:val="24"/>
+          <w:lang w:val="en-US"/>
+        </w:rPr>
+        <w:t>parametrii</w:t>
+      </w:r>
+      <w:proofErr w:type="spellEnd"/>
+      <w:r>
+        <w:rPr>
+          <w:rFonts w:ascii="Times New Roman" w:hAnsi="Times New Roman" w:cs="Times New Roman"/>
+          <w:sz w:val="24"/>
+          <w:lang w:val="en-US"/>
+        </w:rPr>
+        <w:t xml:space="preserve"> </w:t>
+      </w:r>
+      <w:proofErr w:type="spellStart"/>
+      <w:r>
+        <w:rPr>
+          <w:rFonts w:ascii="Times New Roman" w:hAnsi="Times New Roman" w:cs="Times New Roman"/>
+          <w:sz w:val="24"/>
+          <w:lang w:val="en-US"/>
+        </w:rPr>
+        <w:t>semnalelor</w:t>
+      </w:r>
+      <w:proofErr w:type="spellEnd"/>
+      <w:r>
+        <w:rPr>
+          <w:rFonts w:ascii="Times New Roman" w:hAnsi="Times New Roman" w:cs="Times New Roman"/>
+          <w:sz w:val="24"/>
+          <w:lang w:val="en-US"/>
+        </w:rPr>
+        <w:t xml:space="preserve"> PWM </w:t>
+      </w:r>
+      <w:proofErr w:type="spellStart"/>
+      <w:r>
+        <w:rPr>
+          <w:rFonts w:ascii="Times New Roman" w:hAnsi="Times New Roman" w:cs="Times New Roman"/>
+          <w:sz w:val="24"/>
+          <w:lang w:val="en-US"/>
+        </w:rPr>
+        <w:t>necesari</w:t>
+      </w:r>
+      <w:proofErr w:type="spellEnd"/>
+      <w:r>
+        <w:rPr>
+          <w:rFonts w:ascii="Times New Roman" w:hAnsi="Times New Roman" w:cs="Times New Roman"/>
+          <w:sz w:val="24"/>
+          <w:lang w:val="en-US"/>
+        </w:rPr>
+        <w:t xml:space="preserve"> </w:t>
+      </w:r>
+      <w:proofErr w:type="spellStart"/>
+      <w:r>
+        <w:rPr>
+          <w:rFonts w:ascii="Times New Roman" w:hAnsi="Times New Roman" w:cs="Times New Roman"/>
+          <w:sz w:val="24"/>
+          <w:lang w:val="en-US"/>
+        </w:rPr>
+        <w:t>acționării</w:t>
+      </w:r>
+      <w:proofErr w:type="spellEnd"/>
+      <w:r>
+        <w:rPr>
+          <w:rFonts w:ascii="Times New Roman" w:hAnsi="Times New Roman" w:cs="Times New Roman"/>
+          <w:sz w:val="24"/>
+          <w:lang w:val="en-US"/>
+        </w:rPr>
+        <w:t xml:space="preserve"> </w:t>
+      </w:r>
+      <w:proofErr w:type="spellStart"/>
+      <w:r>
+        <w:rPr>
+          <w:rFonts w:ascii="Times New Roman" w:hAnsi="Times New Roman" w:cs="Times New Roman"/>
+          <w:sz w:val="24"/>
+          <w:lang w:val="en-US"/>
+        </w:rPr>
+        <w:t>fiecărui</w:t>
+      </w:r>
+      <w:proofErr w:type="spellEnd"/>
+      <w:r>
+        <w:rPr>
+          <w:rFonts w:ascii="Times New Roman" w:hAnsi="Times New Roman" w:cs="Times New Roman"/>
+          <w:sz w:val="24"/>
+          <w:lang w:val="en-US"/>
+        </w:rPr>
+        <w:t xml:space="preserve"> </w:t>
+      </w:r>
+      <w:proofErr w:type="spellStart"/>
+      <w:r>
+        <w:rPr>
+          <w:rFonts w:ascii="Times New Roman" w:hAnsi="Times New Roman" w:cs="Times New Roman"/>
+          <w:sz w:val="24"/>
+          <w:lang w:val="en-US"/>
+        </w:rPr>
+        <w:t>deget</w:t>
+      </w:r>
+      <w:proofErr w:type="spellEnd"/>
+      <w:r>
+        <w:rPr>
+          <w:rFonts w:ascii="Times New Roman" w:hAnsi="Times New Roman" w:cs="Times New Roman"/>
+          <w:sz w:val="24"/>
+          <w:lang w:val="en-US"/>
+        </w:rPr>
+        <w:t xml:space="preserve"> al </w:t>
+      </w:r>
+      <w:proofErr w:type="spellStart"/>
+      <w:r>
+        <w:rPr>
+          <w:rFonts w:ascii="Times New Roman" w:hAnsi="Times New Roman" w:cs="Times New Roman"/>
+          <w:sz w:val="24"/>
+          <w:lang w:val="en-US"/>
+        </w:rPr>
+        <w:t>structurii</w:t>
+      </w:r>
+      <w:proofErr w:type="spellEnd"/>
+      <w:r>
+        <w:rPr>
+          <w:rFonts w:ascii="Times New Roman" w:hAnsi="Times New Roman" w:cs="Times New Roman"/>
+          <w:sz w:val="24"/>
+          <w:lang w:val="en-US"/>
+        </w:rPr>
+        <w:t xml:space="preserve"> </w:t>
+      </w:r>
+      <w:proofErr w:type="spellStart"/>
+      <w:r>
+        <w:rPr>
+          <w:rFonts w:ascii="Times New Roman" w:hAnsi="Times New Roman" w:cs="Times New Roman"/>
+          <w:sz w:val="24"/>
+          <w:lang w:val="en-US"/>
+        </w:rPr>
+        <w:t>robotice</w:t>
+      </w:r>
+      <w:proofErr w:type="spellEnd"/>
+      <w:r>
+        <w:rPr>
+          <w:rFonts w:ascii="Times New Roman" w:hAnsi="Times New Roman" w:cs="Times New Roman"/>
+          <w:sz w:val="24"/>
+          <w:lang w:val="en-US"/>
+        </w:rPr>
+        <w:t xml:space="preserve">. </w:t>
+      </w:r>
+      <w:proofErr w:type="spellStart"/>
+      <w:r>
+        <w:rPr>
+          <w:rFonts w:ascii="Times New Roman" w:hAnsi="Times New Roman" w:cs="Times New Roman"/>
+          <w:sz w:val="24"/>
+          <w:lang w:val="en-US"/>
+        </w:rPr>
+        <w:t>Aceste</w:t>
+      </w:r>
+      <w:proofErr w:type="spellEnd"/>
+      <w:r>
+        <w:rPr>
+          <w:rFonts w:ascii="Times New Roman" w:hAnsi="Times New Roman" w:cs="Times New Roman"/>
+          <w:sz w:val="24"/>
+          <w:lang w:val="en-US"/>
+        </w:rPr>
+        <w:t xml:space="preserve"> </w:t>
+      </w:r>
+      <w:proofErr w:type="spellStart"/>
+      <w:r>
+        <w:rPr>
+          <w:rFonts w:ascii="Times New Roman" w:hAnsi="Times New Roman" w:cs="Times New Roman"/>
+          <w:sz w:val="24"/>
+          <w:lang w:val="en-US"/>
+        </w:rPr>
+        <w:t>semnale</w:t>
+      </w:r>
+      <w:proofErr w:type="spellEnd"/>
+      <w:r>
+        <w:rPr>
+          <w:rFonts w:ascii="Times New Roman" w:hAnsi="Times New Roman" w:cs="Times New Roman"/>
+          <w:sz w:val="24"/>
+          <w:lang w:val="en-US"/>
+        </w:rPr>
+        <w:t xml:space="preserve"> sunt </w:t>
+      </w:r>
+      <w:proofErr w:type="spellStart"/>
+      <w:r>
+        <w:rPr>
+          <w:rFonts w:ascii="Times New Roman" w:hAnsi="Times New Roman" w:cs="Times New Roman"/>
+          <w:sz w:val="24"/>
+          <w:lang w:val="en-US"/>
+        </w:rPr>
+        <w:t>direcționate</w:t>
+      </w:r>
+      <w:proofErr w:type="spellEnd"/>
+      <w:r>
+        <w:rPr>
+          <w:rFonts w:ascii="Times New Roman" w:hAnsi="Times New Roman" w:cs="Times New Roman"/>
+          <w:sz w:val="24"/>
+          <w:lang w:val="en-US"/>
+        </w:rPr>
+        <w:t xml:space="preserve"> </w:t>
+      </w:r>
+      <w:proofErr w:type="spellStart"/>
+      <w:r>
+        <w:rPr>
+          <w:rFonts w:ascii="Times New Roman" w:hAnsi="Times New Roman" w:cs="Times New Roman"/>
+          <w:sz w:val="24"/>
+          <w:lang w:val="en-US"/>
+        </w:rPr>
+        <w:t>către</w:t>
+      </w:r>
+      <w:proofErr w:type="spellEnd"/>
+      <w:r>
+        <w:rPr>
+          <w:rFonts w:ascii="Times New Roman" w:hAnsi="Times New Roman" w:cs="Times New Roman"/>
+          <w:sz w:val="24"/>
+          <w:lang w:val="en-US"/>
+        </w:rPr>
+        <w:t xml:space="preserve"> </w:t>
+      </w:r>
+      <w:proofErr w:type="spellStart"/>
+      <w:r>
+        <w:rPr>
+          <w:rFonts w:ascii="Times New Roman" w:hAnsi="Times New Roman" w:cs="Times New Roman"/>
+          <w:sz w:val="24"/>
+          <w:lang w:val="en-US"/>
+        </w:rPr>
+        <w:t>pinii</w:t>
+      </w:r>
+      <w:proofErr w:type="spellEnd"/>
+      <w:r>
+        <w:rPr>
+          <w:rFonts w:ascii="Times New Roman" w:hAnsi="Times New Roman" w:cs="Times New Roman"/>
+          <w:sz w:val="24"/>
+          <w:lang w:val="en-US"/>
+        </w:rPr>
+        <w:t xml:space="preserve"> de </w:t>
+      </w:r>
+      <w:proofErr w:type="spellStart"/>
+      <w:r>
+        <w:rPr>
+          <w:rFonts w:ascii="Times New Roman" w:hAnsi="Times New Roman" w:cs="Times New Roman"/>
+          <w:sz w:val="24"/>
+          <w:lang w:val="en-US"/>
+        </w:rPr>
+        <w:t>ieșire</w:t>
+      </w:r>
+      <w:proofErr w:type="spellEnd"/>
+      <w:r>
+        <w:rPr>
+          <w:rFonts w:ascii="Times New Roman" w:hAnsi="Times New Roman" w:cs="Times New Roman"/>
+          <w:sz w:val="24"/>
+          <w:lang w:val="en-US"/>
+        </w:rPr>
+        <w:t xml:space="preserve"> </w:t>
+      </w:r>
+      <w:proofErr w:type="spellStart"/>
+      <w:r>
+        <w:rPr>
+          <w:rFonts w:ascii="Times New Roman" w:hAnsi="Times New Roman" w:cs="Times New Roman"/>
+          <w:sz w:val="24"/>
+          <w:lang w:val="en-US"/>
+        </w:rPr>
+        <w:t>configurați</w:t>
+      </w:r>
+      <w:proofErr w:type="spellEnd"/>
+      <w:r>
+        <w:rPr>
+          <w:rFonts w:ascii="Times New Roman" w:hAnsi="Times New Roman" w:cs="Times New Roman"/>
+          <w:sz w:val="24"/>
+          <w:lang w:val="en-US"/>
+        </w:rPr>
+        <w:t xml:space="preserve">, </w:t>
+      </w:r>
+      <w:proofErr w:type="spellStart"/>
+      <w:r>
+        <w:rPr>
+          <w:rFonts w:ascii="Times New Roman" w:hAnsi="Times New Roman" w:cs="Times New Roman"/>
+          <w:sz w:val="24"/>
+          <w:lang w:val="en-US"/>
+        </w:rPr>
+        <w:t>declanșând</w:t>
+      </w:r>
+      <w:proofErr w:type="spellEnd"/>
+      <w:r>
+        <w:rPr>
+          <w:rFonts w:ascii="Times New Roman" w:hAnsi="Times New Roman" w:cs="Times New Roman"/>
+          <w:sz w:val="24"/>
+          <w:lang w:val="en-US"/>
+        </w:rPr>
+        <w:t xml:space="preserve"> </w:t>
+      </w:r>
+      <w:proofErr w:type="spellStart"/>
+      <w:r>
+        <w:rPr>
+          <w:rFonts w:ascii="Times New Roman" w:hAnsi="Times New Roman" w:cs="Times New Roman"/>
+          <w:sz w:val="24"/>
+          <w:lang w:val="en-US"/>
+        </w:rPr>
+        <w:t>translația</w:t>
+      </w:r>
+      <w:proofErr w:type="spellEnd"/>
+      <w:r>
+        <w:rPr>
+          <w:rFonts w:ascii="Times New Roman" w:hAnsi="Times New Roman" w:cs="Times New Roman"/>
+          <w:sz w:val="24"/>
+          <w:lang w:val="en-US"/>
+        </w:rPr>
+        <w:t xml:space="preserve"> </w:t>
+      </w:r>
+      <w:proofErr w:type="spellStart"/>
+      <w:r>
+        <w:rPr>
+          <w:rFonts w:ascii="Times New Roman" w:hAnsi="Times New Roman" w:cs="Times New Roman"/>
+          <w:sz w:val="24"/>
+          <w:lang w:val="en-US"/>
+        </w:rPr>
+        <w:t>unghiulară</w:t>
+      </w:r>
+      <w:proofErr w:type="spellEnd"/>
+      <w:r>
+        <w:rPr>
+          <w:rFonts w:ascii="Times New Roman" w:hAnsi="Times New Roman" w:cs="Times New Roman"/>
+          <w:sz w:val="24"/>
+          <w:lang w:val="en-US"/>
+        </w:rPr>
+        <w:t xml:space="preserve"> a </w:t>
+      </w:r>
+      <w:proofErr w:type="spellStart"/>
+      <w:r>
+        <w:rPr>
+          <w:rFonts w:ascii="Times New Roman" w:hAnsi="Times New Roman" w:cs="Times New Roman"/>
+          <w:sz w:val="24"/>
+          <w:lang w:val="en-US"/>
+        </w:rPr>
+        <w:t>servomotoarelor</w:t>
+      </w:r>
+      <w:proofErr w:type="spellEnd"/>
+      <w:r>
+        <w:rPr>
+          <w:rFonts w:ascii="Times New Roman" w:hAnsi="Times New Roman" w:cs="Times New Roman"/>
+          <w:sz w:val="24"/>
+          <w:lang w:val="en-US"/>
+        </w:rPr>
+        <w:t xml:space="preserve"> conform </w:t>
+      </w:r>
+      <w:proofErr w:type="spellStart"/>
+      <w:r>
+        <w:rPr>
+          <w:rFonts w:ascii="Times New Roman" w:hAnsi="Times New Roman" w:cs="Times New Roman"/>
+          <w:sz w:val="24"/>
+          <w:lang w:val="en-US"/>
+        </w:rPr>
+        <w:t>setărilor</w:t>
+      </w:r>
+      <w:proofErr w:type="spellEnd"/>
+      <w:r>
+        <w:rPr>
+          <w:rFonts w:ascii="Times New Roman" w:hAnsi="Times New Roman" w:cs="Times New Roman"/>
+          <w:sz w:val="24"/>
+          <w:lang w:val="en-US"/>
+        </w:rPr>
+        <w:t xml:space="preserve"> </w:t>
+      </w:r>
+      <w:proofErr w:type="spellStart"/>
+      <w:r>
+        <w:rPr>
+          <w:rFonts w:ascii="Times New Roman" w:hAnsi="Times New Roman" w:cs="Times New Roman"/>
+          <w:sz w:val="24"/>
+          <w:lang w:val="en-US"/>
+        </w:rPr>
+        <w:t>recepționate</w:t>
+      </w:r>
+      <w:proofErr w:type="spellEnd"/>
+      <w:r>
+        <w:rPr>
+          <w:rFonts w:ascii="Times New Roman" w:hAnsi="Times New Roman" w:cs="Times New Roman"/>
+          <w:sz w:val="24"/>
+          <w:lang w:val="en-US"/>
+        </w:rPr>
+        <w:t xml:space="preserve">. </w:t>
+      </w:r>
+      <w:proofErr w:type="spellStart"/>
+      <w:r>
+        <w:rPr>
+          <w:rFonts w:ascii="Times New Roman" w:hAnsi="Times New Roman" w:cs="Times New Roman"/>
+          <w:sz w:val="24"/>
+          <w:lang w:val="en-US"/>
+        </w:rPr>
+        <w:t>Grație</w:t>
+      </w:r>
+      <w:proofErr w:type="spellEnd"/>
+      <w:r>
+        <w:rPr>
+          <w:rFonts w:ascii="Times New Roman" w:hAnsi="Times New Roman" w:cs="Times New Roman"/>
+          <w:sz w:val="24"/>
+          <w:lang w:val="en-US"/>
+        </w:rPr>
+        <w:t xml:space="preserve"> </w:t>
+      </w:r>
+      <w:proofErr w:type="spellStart"/>
+      <w:r>
+        <w:rPr>
+          <w:rFonts w:ascii="Times New Roman" w:hAnsi="Times New Roman" w:cs="Times New Roman"/>
+          <w:sz w:val="24"/>
+          <w:lang w:val="en-US"/>
+        </w:rPr>
+        <w:t>arhitecturii</w:t>
+      </w:r>
+      <w:proofErr w:type="spellEnd"/>
+      <w:r>
+        <w:rPr>
+          <w:rFonts w:ascii="Times New Roman" w:hAnsi="Times New Roman" w:cs="Times New Roman"/>
+          <w:sz w:val="24"/>
+          <w:lang w:val="en-US"/>
+        </w:rPr>
+        <w:t xml:space="preserve"> de </w:t>
+      </w:r>
+      <w:proofErr w:type="spellStart"/>
+      <w:r>
+        <w:rPr>
+          <w:rFonts w:ascii="Times New Roman" w:hAnsi="Times New Roman" w:cs="Times New Roman"/>
+          <w:sz w:val="24"/>
+          <w:lang w:val="en-US"/>
+        </w:rPr>
+        <w:t>procesare</w:t>
+      </w:r>
+      <w:proofErr w:type="spellEnd"/>
+      <w:r>
+        <w:rPr>
+          <w:rFonts w:ascii="Times New Roman" w:hAnsi="Times New Roman" w:cs="Times New Roman"/>
+          <w:sz w:val="24"/>
+          <w:lang w:val="en-US"/>
+        </w:rPr>
+        <w:t xml:space="preserve"> </w:t>
+      </w:r>
+      <w:proofErr w:type="spellStart"/>
+      <w:r>
+        <w:rPr>
+          <w:rFonts w:ascii="Times New Roman" w:hAnsi="Times New Roman" w:cs="Times New Roman"/>
+          <w:sz w:val="24"/>
+          <w:lang w:val="en-US"/>
+        </w:rPr>
+        <w:t>paralele</w:t>
+      </w:r>
+      <w:proofErr w:type="spellEnd"/>
+      <w:r>
+        <w:rPr>
+          <w:rFonts w:ascii="Times New Roman" w:hAnsi="Times New Roman" w:cs="Times New Roman"/>
+          <w:sz w:val="24"/>
+          <w:lang w:val="en-US"/>
+        </w:rPr>
+        <w:t xml:space="preserve">, ESP32 </w:t>
+      </w:r>
+      <w:proofErr w:type="spellStart"/>
+      <w:r>
+        <w:rPr>
+          <w:rFonts w:ascii="Times New Roman" w:hAnsi="Times New Roman" w:cs="Times New Roman"/>
+          <w:sz w:val="24"/>
+          <w:lang w:val="en-US"/>
+        </w:rPr>
         <w:lastRenderedPageBreak/>
-        <w:t>Unitatea</w:t>
-      </w:r>
-      <w:proofErr w:type="spellEnd"/>
-      <w:r>
-        <w:rPr>
-          <w:rFonts w:ascii="Times New Roman" w:hAnsi="Times New Roman" w:cs="Times New Roman"/>
-          <w:sz w:val="24"/>
-          <w:lang w:val="en-US"/>
-        </w:rPr>
-        <w:t xml:space="preserve"> </w:t>
-      </w:r>
-      <w:proofErr w:type="spellStart"/>
-      <w:r>
-        <w:rPr>
-          <w:rFonts w:ascii="Times New Roman" w:hAnsi="Times New Roman" w:cs="Times New Roman"/>
-          <w:sz w:val="24"/>
-          <w:lang w:val="en-US"/>
-        </w:rPr>
-        <w:t>centrală</w:t>
-      </w:r>
-      <w:proofErr w:type="spellEnd"/>
-      <w:r>
-        <w:rPr>
-          <w:rFonts w:ascii="Times New Roman" w:hAnsi="Times New Roman" w:cs="Times New Roman"/>
-          <w:sz w:val="24"/>
-          <w:lang w:val="en-US"/>
-        </w:rPr>
-        <w:t xml:space="preserve"> de </w:t>
-      </w:r>
-      <w:proofErr w:type="spellStart"/>
-      <w:r>
-        <w:rPr>
-          <w:rFonts w:ascii="Times New Roman" w:hAnsi="Times New Roman" w:cs="Times New Roman"/>
-          <w:sz w:val="24"/>
-          <w:lang w:val="en-US"/>
-        </w:rPr>
-        <w:t>procesare</w:t>
-      </w:r>
-      <w:proofErr w:type="spellEnd"/>
-      <w:r>
-        <w:rPr>
-          <w:rFonts w:ascii="Times New Roman" w:hAnsi="Times New Roman" w:cs="Times New Roman"/>
-          <w:sz w:val="24"/>
-          <w:lang w:val="en-US"/>
-        </w:rPr>
-        <w:t xml:space="preserve"> </w:t>
-      </w:r>
-      <w:proofErr w:type="spellStart"/>
-      <w:r>
-        <w:rPr>
-          <w:rFonts w:ascii="Times New Roman" w:hAnsi="Times New Roman" w:cs="Times New Roman"/>
-          <w:sz w:val="24"/>
-          <w:lang w:val="en-US"/>
-        </w:rPr>
-        <w:t>recepționează</w:t>
-      </w:r>
-      <w:proofErr w:type="spellEnd"/>
-      <w:r>
-        <w:rPr>
-          <w:rFonts w:ascii="Times New Roman" w:hAnsi="Times New Roman" w:cs="Times New Roman"/>
-          <w:sz w:val="24"/>
-          <w:lang w:val="en-US"/>
-        </w:rPr>
-        <w:t xml:space="preserve"> </w:t>
-      </w:r>
-      <w:proofErr w:type="spellStart"/>
-      <w:r>
-        <w:rPr>
-          <w:rFonts w:ascii="Times New Roman" w:hAnsi="Times New Roman" w:cs="Times New Roman"/>
-          <w:sz w:val="24"/>
-          <w:lang w:val="en-US"/>
-        </w:rPr>
-        <w:t>și</w:t>
-      </w:r>
-      <w:proofErr w:type="spellEnd"/>
-      <w:r>
-        <w:rPr>
-          <w:rFonts w:ascii="Times New Roman" w:hAnsi="Times New Roman" w:cs="Times New Roman"/>
-          <w:sz w:val="24"/>
-          <w:lang w:val="en-US"/>
-        </w:rPr>
-        <w:t xml:space="preserve"> </w:t>
-      </w:r>
-      <w:proofErr w:type="spellStart"/>
-      <w:r>
-        <w:rPr>
-          <w:rFonts w:ascii="Times New Roman" w:hAnsi="Times New Roman" w:cs="Times New Roman"/>
-          <w:sz w:val="24"/>
-          <w:lang w:val="en-US"/>
-        </w:rPr>
-        <w:t>decodează</w:t>
-      </w:r>
-      <w:proofErr w:type="spellEnd"/>
-      <w:r>
-        <w:rPr>
-          <w:rFonts w:ascii="Times New Roman" w:hAnsi="Times New Roman" w:cs="Times New Roman"/>
-          <w:sz w:val="24"/>
-          <w:lang w:val="en-US"/>
-        </w:rPr>
-        <w:t xml:space="preserve"> </w:t>
-      </w:r>
-      <w:proofErr w:type="spellStart"/>
-      <w:r>
-        <w:rPr>
-          <w:rFonts w:ascii="Times New Roman" w:hAnsi="Times New Roman" w:cs="Times New Roman"/>
-          <w:sz w:val="24"/>
-          <w:lang w:val="en-US"/>
-        </w:rPr>
-        <w:t>pachetele</w:t>
-      </w:r>
-      <w:proofErr w:type="spellEnd"/>
-      <w:r>
-        <w:rPr>
-          <w:rFonts w:ascii="Times New Roman" w:hAnsi="Times New Roman" w:cs="Times New Roman"/>
-          <w:sz w:val="24"/>
-          <w:lang w:val="en-US"/>
-        </w:rPr>
-        <w:t xml:space="preserve"> de date, </w:t>
-      </w:r>
-      <w:proofErr w:type="spellStart"/>
-      <w:r>
-        <w:rPr>
-          <w:rFonts w:ascii="Times New Roman" w:hAnsi="Times New Roman" w:cs="Times New Roman"/>
-          <w:sz w:val="24"/>
-          <w:lang w:val="en-US"/>
-        </w:rPr>
-        <w:t>calculând</w:t>
-      </w:r>
-      <w:proofErr w:type="spellEnd"/>
-      <w:r>
-        <w:rPr>
-          <w:rFonts w:ascii="Times New Roman" w:hAnsi="Times New Roman" w:cs="Times New Roman"/>
-          <w:sz w:val="24"/>
-          <w:lang w:val="en-US"/>
-        </w:rPr>
-        <w:t xml:space="preserve"> </w:t>
-      </w:r>
-      <w:proofErr w:type="spellStart"/>
-      <w:r>
-        <w:rPr>
-          <w:rFonts w:ascii="Times New Roman" w:hAnsi="Times New Roman" w:cs="Times New Roman"/>
-          <w:sz w:val="24"/>
-          <w:lang w:val="en-US"/>
-        </w:rPr>
-        <w:t>parametrii</w:t>
-      </w:r>
-      <w:proofErr w:type="spellEnd"/>
-      <w:r>
-        <w:rPr>
-          <w:rFonts w:ascii="Times New Roman" w:hAnsi="Times New Roman" w:cs="Times New Roman"/>
-          <w:sz w:val="24"/>
-          <w:lang w:val="en-US"/>
-        </w:rPr>
-        <w:t xml:space="preserve"> </w:t>
-      </w:r>
-      <w:proofErr w:type="spellStart"/>
-      <w:r>
-        <w:rPr>
-          <w:rFonts w:ascii="Times New Roman" w:hAnsi="Times New Roman" w:cs="Times New Roman"/>
-          <w:sz w:val="24"/>
-          <w:lang w:val="en-US"/>
-        </w:rPr>
-        <w:t>semnalelor</w:t>
-      </w:r>
-      <w:proofErr w:type="spellEnd"/>
-      <w:r>
-        <w:rPr>
-          <w:rFonts w:ascii="Times New Roman" w:hAnsi="Times New Roman" w:cs="Times New Roman"/>
-          <w:sz w:val="24"/>
-          <w:lang w:val="en-US"/>
-        </w:rPr>
-        <w:t xml:space="preserve"> PWM </w:t>
-      </w:r>
-      <w:proofErr w:type="spellStart"/>
-      <w:r>
-        <w:rPr>
-          <w:rFonts w:ascii="Times New Roman" w:hAnsi="Times New Roman" w:cs="Times New Roman"/>
-          <w:sz w:val="24"/>
-          <w:lang w:val="en-US"/>
-        </w:rPr>
-        <w:t>necesari</w:t>
-      </w:r>
-      <w:proofErr w:type="spellEnd"/>
-      <w:r>
-        <w:rPr>
-          <w:rFonts w:ascii="Times New Roman" w:hAnsi="Times New Roman" w:cs="Times New Roman"/>
-          <w:sz w:val="24"/>
-          <w:lang w:val="en-US"/>
-        </w:rPr>
-        <w:t xml:space="preserve"> </w:t>
-      </w:r>
-      <w:proofErr w:type="spellStart"/>
-      <w:r>
-        <w:rPr>
-          <w:rFonts w:ascii="Times New Roman" w:hAnsi="Times New Roman" w:cs="Times New Roman"/>
-          <w:sz w:val="24"/>
-          <w:lang w:val="en-US"/>
-        </w:rPr>
-        <w:t>acționării</w:t>
-      </w:r>
-      <w:proofErr w:type="spellEnd"/>
-      <w:r>
-        <w:rPr>
-          <w:rFonts w:ascii="Times New Roman" w:hAnsi="Times New Roman" w:cs="Times New Roman"/>
-          <w:sz w:val="24"/>
-          <w:lang w:val="en-US"/>
-        </w:rPr>
-        <w:t xml:space="preserve"> </w:t>
-      </w:r>
-      <w:proofErr w:type="spellStart"/>
-      <w:r>
-        <w:rPr>
-          <w:rFonts w:ascii="Times New Roman" w:hAnsi="Times New Roman" w:cs="Times New Roman"/>
-          <w:sz w:val="24"/>
-          <w:lang w:val="en-US"/>
-        </w:rPr>
-        <w:t>fiecărui</w:t>
-      </w:r>
-      <w:proofErr w:type="spellEnd"/>
-      <w:r>
-        <w:rPr>
-          <w:rFonts w:ascii="Times New Roman" w:hAnsi="Times New Roman" w:cs="Times New Roman"/>
-          <w:sz w:val="24"/>
-          <w:lang w:val="en-US"/>
-        </w:rPr>
-        <w:t xml:space="preserve"> </w:t>
-      </w:r>
-      <w:proofErr w:type="spellStart"/>
-      <w:r>
-        <w:rPr>
-          <w:rFonts w:ascii="Times New Roman" w:hAnsi="Times New Roman" w:cs="Times New Roman"/>
-          <w:sz w:val="24"/>
-          <w:lang w:val="en-US"/>
-        </w:rPr>
-        <w:t>deget</w:t>
-      </w:r>
-      <w:proofErr w:type="spellEnd"/>
-      <w:r>
-        <w:rPr>
-          <w:rFonts w:ascii="Times New Roman" w:hAnsi="Times New Roman" w:cs="Times New Roman"/>
-          <w:sz w:val="24"/>
-          <w:lang w:val="en-US"/>
-        </w:rPr>
-        <w:t xml:space="preserve"> al </w:t>
-      </w:r>
-      <w:proofErr w:type="spellStart"/>
-      <w:r>
-        <w:rPr>
-          <w:rFonts w:ascii="Times New Roman" w:hAnsi="Times New Roman" w:cs="Times New Roman"/>
-          <w:sz w:val="24"/>
-          <w:lang w:val="en-US"/>
-        </w:rPr>
-        <w:t>structurii</w:t>
-      </w:r>
-      <w:proofErr w:type="spellEnd"/>
-      <w:r>
-        <w:rPr>
-          <w:rFonts w:ascii="Times New Roman" w:hAnsi="Times New Roman" w:cs="Times New Roman"/>
-          <w:sz w:val="24"/>
-          <w:lang w:val="en-US"/>
-        </w:rPr>
-        <w:t xml:space="preserve"> </w:t>
-      </w:r>
-      <w:proofErr w:type="spellStart"/>
-      <w:r>
-        <w:rPr>
-          <w:rFonts w:ascii="Times New Roman" w:hAnsi="Times New Roman" w:cs="Times New Roman"/>
-          <w:sz w:val="24"/>
-          <w:lang w:val="en-US"/>
-        </w:rPr>
-        <w:t>robotice</w:t>
-      </w:r>
-      <w:proofErr w:type="spellEnd"/>
-      <w:r>
-        <w:rPr>
-          <w:rFonts w:ascii="Times New Roman" w:hAnsi="Times New Roman" w:cs="Times New Roman"/>
-          <w:sz w:val="24"/>
-          <w:lang w:val="en-US"/>
-        </w:rPr>
-        <w:t xml:space="preserve">. </w:t>
-      </w:r>
-      <w:proofErr w:type="spellStart"/>
-      <w:r>
-        <w:rPr>
-          <w:rFonts w:ascii="Times New Roman" w:hAnsi="Times New Roman" w:cs="Times New Roman"/>
-          <w:sz w:val="24"/>
-          <w:lang w:val="en-US"/>
-        </w:rPr>
-        <w:t>Aceste</w:t>
-      </w:r>
-      <w:proofErr w:type="spellEnd"/>
-      <w:r>
-        <w:rPr>
-          <w:rFonts w:ascii="Times New Roman" w:hAnsi="Times New Roman" w:cs="Times New Roman"/>
-          <w:sz w:val="24"/>
-          <w:lang w:val="en-US"/>
-        </w:rPr>
-        <w:t xml:space="preserve"> </w:t>
-      </w:r>
-      <w:proofErr w:type="spellStart"/>
-      <w:r>
-        <w:rPr>
-          <w:rFonts w:ascii="Times New Roman" w:hAnsi="Times New Roman" w:cs="Times New Roman"/>
-          <w:sz w:val="24"/>
-          <w:lang w:val="en-US"/>
-        </w:rPr>
-        <w:t>semnale</w:t>
-      </w:r>
-      <w:proofErr w:type="spellEnd"/>
-      <w:r>
-        <w:rPr>
-          <w:rFonts w:ascii="Times New Roman" w:hAnsi="Times New Roman" w:cs="Times New Roman"/>
-          <w:sz w:val="24"/>
-          <w:lang w:val="en-US"/>
-        </w:rPr>
-        <w:t xml:space="preserve"> sunt </w:t>
-      </w:r>
-      <w:proofErr w:type="spellStart"/>
-      <w:r>
-        <w:rPr>
-          <w:rFonts w:ascii="Times New Roman" w:hAnsi="Times New Roman" w:cs="Times New Roman"/>
-          <w:sz w:val="24"/>
-          <w:lang w:val="en-US"/>
-        </w:rPr>
-        <w:t>direcționate</w:t>
-      </w:r>
-      <w:proofErr w:type="spellEnd"/>
-      <w:r>
-        <w:rPr>
-          <w:rFonts w:ascii="Times New Roman" w:hAnsi="Times New Roman" w:cs="Times New Roman"/>
-          <w:sz w:val="24"/>
-          <w:lang w:val="en-US"/>
-        </w:rPr>
-        <w:t xml:space="preserve"> </w:t>
-      </w:r>
-      <w:proofErr w:type="spellStart"/>
-      <w:r>
-        <w:rPr>
-          <w:rFonts w:ascii="Times New Roman" w:hAnsi="Times New Roman" w:cs="Times New Roman"/>
-          <w:sz w:val="24"/>
-          <w:lang w:val="en-US"/>
-        </w:rPr>
-        <w:t>către</w:t>
-      </w:r>
-      <w:proofErr w:type="spellEnd"/>
-      <w:r>
-        <w:rPr>
-          <w:rFonts w:ascii="Times New Roman" w:hAnsi="Times New Roman" w:cs="Times New Roman"/>
-          <w:sz w:val="24"/>
-          <w:lang w:val="en-US"/>
-        </w:rPr>
-        <w:t xml:space="preserve"> </w:t>
-      </w:r>
-      <w:proofErr w:type="spellStart"/>
-      <w:r>
-        <w:rPr>
-          <w:rFonts w:ascii="Times New Roman" w:hAnsi="Times New Roman" w:cs="Times New Roman"/>
-          <w:sz w:val="24"/>
-          <w:lang w:val="en-US"/>
-        </w:rPr>
-        <w:t>pinii</w:t>
-      </w:r>
-      <w:proofErr w:type="spellEnd"/>
-      <w:r>
-        <w:rPr>
-          <w:rFonts w:ascii="Times New Roman" w:hAnsi="Times New Roman" w:cs="Times New Roman"/>
-          <w:sz w:val="24"/>
-          <w:lang w:val="en-US"/>
-        </w:rPr>
-        <w:t xml:space="preserve"> de </w:t>
-      </w:r>
-      <w:proofErr w:type="spellStart"/>
-      <w:r>
-        <w:rPr>
-          <w:rFonts w:ascii="Times New Roman" w:hAnsi="Times New Roman" w:cs="Times New Roman"/>
-          <w:sz w:val="24"/>
-          <w:lang w:val="en-US"/>
-        </w:rPr>
-        <w:t>ieșire</w:t>
-      </w:r>
-      <w:proofErr w:type="spellEnd"/>
-      <w:r>
-        <w:rPr>
-          <w:rFonts w:ascii="Times New Roman" w:hAnsi="Times New Roman" w:cs="Times New Roman"/>
-          <w:sz w:val="24"/>
-          <w:lang w:val="en-US"/>
-        </w:rPr>
-        <w:t xml:space="preserve"> </w:t>
-      </w:r>
-      <w:proofErr w:type="spellStart"/>
-      <w:r>
-        <w:rPr>
-          <w:rFonts w:ascii="Times New Roman" w:hAnsi="Times New Roman" w:cs="Times New Roman"/>
-          <w:sz w:val="24"/>
-          <w:lang w:val="en-US"/>
-        </w:rPr>
-        <w:t>configurați</w:t>
-      </w:r>
-      <w:proofErr w:type="spellEnd"/>
-      <w:r>
-        <w:rPr>
-          <w:rFonts w:ascii="Times New Roman" w:hAnsi="Times New Roman" w:cs="Times New Roman"/>
-          <w:sz w:val="24"/>
-          <w:lang w:val="en-US"/>
-        </w:rPr>
-        <w:t xml:space="preserve">, </w:t>
-      </w:r>
-      <w:proofErr w:type="spellStart"/>
-      <w:r>
-        <w:rPr>
-          <w:rFonts w:ascii="Times New Roman" w:hAnsi="Times New Roman" w:cs="Times New Roman"/>
-          <w:sz w:val="24"/>
-          <w:lang w:val="en-US"/>
-        </w:rPr>
-        <w:t>declanșând</w:t>
-      </w:r>
-      <w:proofErr w:type="spellEnd"/>
-      <w:r>
-        <w:rPr>
-          <w:rFonts w:ascii="Times New Roman" w:hAnsi="Times New Roman" w:cs="Times New Roman"/>
-          <w:sz w:val="24"/>
-          <w:lang w:val="en-US"/>
-        </w:rPr>
-        <w:t xml:space="preserve"> </w:t>
-      </w:r>
-      <w:proofErr w:type="spellStart"/>
-      <w:r>
-        <w:rPr>
-          <w:rFonts w:ascii="Times New Roman" w:hAnsi="Times New Roman" w:cs="Times New Roman"/>
-          <w:sz w:val="24"/>
-          <w:lang w:val="en-US"/>
-        </w:rPr>
-        <w:t>translația</w:t>
-      </w:r>
-      <w:proofErr w:type="spellEnd"/>
-      <w:r>
-        <w:rPr>
-          <w:rFonts w:ascii="Times New Roman" w:hAnsi="Times New Roman" w:cs="Times New Roman"/>
-          <w:sz w:val="24"/>
-          <w:lang w:val="en-US"/>
-        </w:rPr>
-        <w:t xml:space="preserve"> </w:t>
-      </w:r>
-      <w:proofErr w:type="spellStart"/>
-      <w:r>
-        <w:rPr>
-          <w:rFonts w:ascii="Times New Roman" w:hAnsi="Times New Roman" w:cs="Times New Roman"/>
-          <w:sz w:val="24"/>
-          <w:lang w:val="en-US"/>
-        </w:rPr>
-        <w:t>unghiulară</w:t>
-      </w:r>
-      <w:proofErr w:type="spellEnd"/>
-      <w:r>
-        <w:rPr>
-          <w:rFonts w:ascii="Times New Roman" w:hAnsi="Times New Roman" w:cs="Times New Roman"/>
-          <w:sz w:val="24"/>
-          <w:lang w:val="en-US"/>
-        </w:rPr>
-        <w:t xml:space="preserve"> a </w:t>
-      </w:r>
-      <w:proofErr w:type="spellStart"/>
-      <w:r>
-        <w:rPr>
-          <w:rFonts w:ascii="Times New Roman" w:hAnsi="Times New Roman" w:cs="Times New Roman"/>
-          <w:sz w:val="24"/>
-          <w:lang w:val="en-US"/>
-        </w:rPr>
-        <w:t>servomotoarelor</w:t>
-      </w:r>
-      <w:proofErr w:type="spellEnd"/>
-      <w:r>
-        <w:rPr>
-          <w:rFonts w:ascii="Times New Roman" w:hAnsi="Times New Roman" w:cs="Times New Roman"/>
-          <w:sz w:val="24"/>
-          <w:lang w:val="en-US"/>
-        </w:rPr>
-        <w:t xml:space="preserve"> conform </w:t>
-      </w:r>
-      <w:proofErr w:type="spellStart"/>
-      <w:r>
-        <w:rPr>
-          <w:rFonts w:ascii="Times New Roman" w:hAnsi="Times New Roman" w:cs="Times New Roman"/>
-          <w:sz w:val="24"/>
-          <w:lang w:val="en-US"/>
-        </w:rPr>
-        <w:t>setărilor</w:t>
-      </w:r>
-      <w:proofErr w:type="spellEnd"/>
-      <w:r>
-        <w:rPr>
-          <w:rFonts w:ascii="Times New Roman" w:hAnsi="Times New Roman" w:cs="Times New Roman"/>
-          <w:sz w:val="24"/>
-          <w:lang w:val="en-US"/>
-        </w:rPr>
-        <w:t xml:space="preserve"> </w:t>
-      </w:r>
-      <w:proofErr w:type="spellStart"/>
-      <w:r>
-        <w:rPr>
-          <w:rFonts w:ascii="Times New Roman" w:hAnsi="Times New Roman" w:cs="Times New Roman"/>
-          <w:sz w:val="24"/>
-          <w:lang w:val="en-US"/>
-        </w:rPr>
-        <w:t>recepționate</w:t>
-      </w:r>
-      <w:proofErr w:type="spellEnd"/>
-      <w:r>
-        <w:rPr>
-          <w:rFonts w:ascii="Times New Roman" w:hAnsi="Times New Roman" w:cs="Times New Roman"/>
-          <w:sz w:val="24"/>
-          <w:lang w:val="en-US"/>
-        </w:rPr>
-        <w:t xml:space="preserve">. </w:t>
-      </w:r>
-      <w:proofErr w:type="spellStart"/>
-      <w:r>
-        <w:rPr>
-          <w:rFonts w:ascii="Times New Roman" w:hAnsi="Times New Roman" w:cs="Times New Roman"/>
-          <w:sz w:val="24"/>
-          <w:lang w:val="en-US"/>
-        </w:rPr>
-        <w:t>Grație</w:t>
-      </w:r>
-      <w:proofErr w:type="spellEnd"/>
-      <w:r>
-        <w:rPr>
-          <w:rFonts w:ascii="Times New Roman" w:hAnsi="Times New Roman" w:cs="Times New Roman"/>
-          <w:sz w:val="24"/>
-          <w:lang w:val="en-US"/>
-        </w:rPr>
-        <w:t xml:space="preserve"> </w:t>
-      </w:r>
-      <w:proofErr w:type="spellStart"/>
-      <w:r>
-        <w:rPr>
-          <w:rFonts w:ascii="Times New Roman" w:hAnsi="Times New Roman" w:cs="Times New Roman"/>
-          <w:sz w:val="24"/>
-          <w:lang w:val="en-US"/>
-        </w:rPr>
-        <w:t>arhitecturii</w:t>
-      </w:r>
-      <w:proofErr w:type="spellEnd"/>
-      <w:r>
-        <w:rPr>
-          <w:rFonts w:ascii="Times New Roman" w:hAnsi="Times New Roman" w:cs="Times New Roman"/>
-          <w:sz w:val="24"/>
-          <w:lang w:val="en-US"/>
-        </w:rPr>
-        <w:t xml:space="preserve"> de </w:t>
-      </w:r>
-      <w:proofErr w:type="spellStart"/>
-      <w:r>
-        <w:rPr>
-          <w:rFonts w:ascii="Times New Roman" w:hAnsi="Times New Roman" w:cs="Times New Roman"/>
-          <w:sz w:val="24"/>
-          <w:lang w:val="en-US"/>
-        </w:rPr>
-        <w:t>procesare</w:t>
-      </w:r>
-      <w:proofErr w:type="spellEnd"/>
-      <w:r>
-        <w:rPr>
-          <w:rFonts w:ascii="Times New Roman" w:hAnsi="Times New Roman" w:cs="Times New Roman"/>
-          <w:sz w:val="24"/>
-          <w:lang w:val="en-US"/>
-        </w:rPr>
-        <w:t xml:space="preserve"> </w:t>
-      </w:r>
-      <w:proofErr w:type="spellStart"/>
-      <w:r>
-        <w:rPr>
-          <w:rFonts w:ascii="Times New Roman" w:hAnsi="Times New Roman" w:cs="Times New Roman"/>
-          <w:sz w:val="24"/>
-          <w:lang w:val="en-US"/>
-        </w:rPr>
-        <w:t>paralele</w:t>
-      </w:r>
-      <w:proofErr w:type="spellEnd"/>
-      <w:r>
-        <w:rPr>
-          <w:rFonts w:ascii="Times New Roman" w:hAnsi="Times New Roman" w:cs="Times New Roman"/>
-          <w:sz w:val="24"/>
-          <w:lang w:val="en-US"/>
-        </w:rPr>
-        <w:t xml:space="preserve">, ESP32 </w:t>
-      </w:r>
-      <w:proofErr w:type="spellStart"/>
-      <w:r>
-        <w:rPr>
-          <w:rFonts w:ascii="Times New Roman" w:hAnsi="Times New Roman" w:cs="Times New Roman"/>
-          <w:sz w:val="24"/>
-          <w:lang w:val="en-US"/>
-        </w:rPr>
         <w:t>gestionează</w:t>
       </w:r>
       <w:proofErr w:type="spellEnd"/>
@@ -49319,14 +49153,22 @@
         </w:rPr>
         <w:t>utilizator</w:t>
       </w:r>
-      <w:proofErr w:type="spellEnd"/>
-      <w:r>
-        <w:rPr>
-          <w:rFonts w:ascii="Times New Roman" w:hAnsi="Times New Roman" w:cs="Times New Roman"/>
-          <w:sz w:val="24"/>
-          <w:lang w:val="en-US"/>
-        </w:rPr>
-        <w:t xml:space="preserve"> (UI), </w:t>
+      <w:r>
+        <w:rPr>
+          <w:rFonts w:ascii="Times New Roman" w:hAnsi="Times New Roman" w:cs="Times New Roman"/>
+          <w:sz w:val="24"/>
+          <w:lang w:val="en-US"/>
+        </w:rPr>
+        <w:t>ului</w:t>
+      </w:r>
+      <w:proofErr w:type="spellEnd"/>
+      <w:r>
+        <w:rPr>
+          <w:rFonts w:ascii="Times New Roman" w:hAnsi="Times New Roman" w:cs="Times New Roman"/>
+          <w:sz w:val="24"/>
+          <w:lang w:val="en-US"/>
+        </w:rPr>
+        <w:t xml:space="preserve">, </w:t>
       </w:r>
       <w:proofErr w:type="spellStart"/>
       <w:r>
@@ -49775,7 +49617,62 @@
           <w:rFonts w:ascii="Times New Roman" w:hAnsi="Times New Roman" w:cs="Times New Roman"/>
           <w:sz w:val="24"/>
         </w:rPr>
-        <w:t xml:space="preserve">Din perspectivă computațională, sistemul suportă execuția simultană a comenzilor pentru întregul ansamblu de servomotoare, evitând blocarea microcontrolerului prin implementarea unui mecanism asincron de gestionare a evenimentelor bazat pe funcții </w:t>
+        <w:t>Din perspectivă computațională, sistemul suportă execuția simultană a comenzilor pentru întregul ansamblu de servomotoare, evitând blocarea microcontrolerului</w:t>
+      </w:r>
+      <w:r>
+        <w:rPr>
+          <w:rFonts w:ascii="Times New Roman" w:hAnsi="Times New Roman" w:cs="Times New Roman"/>
+          <w:sz w:val="24"/>
+        </w:rPr>
+        <w:t xml:space="preserve"> </w:t>
+      </w:r>
+      <w:r>
+        <w:rPr>
+          <w:rFonts w:ascii="Times New Roman" w:hAnsi="Times New Roman" w:cs="Times New Roman"/>
+          <w:sz w:val="24"/>
+        </w:rPr>
+        <w:t>[</w:t>
+      </w:r>
+      <w:r>
+        <w:rPr>
+          <w:rFonts w:ascii="Times New Roman" w:hAnsi="Times New Roman" w:cs="Times New Roman"/>
+          <w:sz w:val="24"/>
+        </w:rPr>
+        <w:fldChar w:fldCharType="begin"/>
+      </w:r>
+      <w:r>
+        <w:rPr>
+          <w:rFonts w:ascii="Times New Roman" w:hAnsi="Times New Roman" w:cs="Times New Roman"/>
+          <w:sz w:val="24"/>
+        </w:rPr>
+        <w:instrText xml:space="preserve"> REF _Ref223944065 \h </w:instrText>
+      </w:r>
+      <w:r>
+        <w:rPr>
+          <w:rFonts w:ascii="Times New Roman" w:hAnsi="Times New Roman" w:cs="Times New Roman"/>
+          <w:sz w:val="24"/>
+        </w:rPr>
+      </w:r>
+      <w:r>
+        <w:rPr>
+          <w:rFonts w:ascii="Times New Roman" w:hAnsi="Times New Roman" w:cs="Times New Roman"/>
+          <w:sz w:val="24"/>
+        </w:rPr>
+        <w:instrText xml:space="preserve"> \* MERGEFORMAT </w:instrText>
+      </w:r>
+      <w:r>
+        <w:rPr>
+          <w:rFonts w:ascii="Times New Roman" w:hAnsi="Times New Roman" w:cs="Times New Roman"/>
+          <w:sz w:val="24"/>
+        </w:rPr>
+        <w:fldChar w:fldCharType="separate"/>
+      </w:r>
+      <w:r>
+        <w:rPr>
+          <w:rFonts w:ascii="Times New Roman" w:hAnsi="Times New Roman" w:cs="Times New Roman"/>
+          <w:sz w:val="24"/>
+        </w:rPr>
+        <w:t xml:space="preserve">3.2. Evenimente și </w:t>
       </w:r>
       <w:proofErr w:type="spellStart"/>
       <w:r>
@@ -49791,23 +49688,28 @@
           <w:rFonts w:ascii="Times New Roman" w:hAnsi="Times New Roman" w:cs="Times New Roman"/>
           <w:sz w:val="24"/>
         </w:rPr>
-        <w:t xml:space="preserve">. Acest model de programare permite procesarea noilor vectori de poziție în paralel cu mișcarea curentă a </w:t>
-      </w:r>
-      <w:proofErr w:type="spellStart"/>
-      <w:r>
-        <w:rPr>
-          <w:rFonts w:ascii="Times New Roman" w:hAnsi="Times New Roman" w:cs="Times New Roman"/>
-          <w:sz w:val="24"/>
-        </w:rPr>
-        <w:t>actuatoarelor</w:t>
-      </w:r>
-      <w:proofErr w:type="spellEnd"/>
-      <w:r>
-        <w:rPr>
-          <w:rFonts w:ascii="Times New Roman" w:hAnsi="Times New Roman" w:cs="Times New Roman"/>
-          <w:sz w:val="24"/>
-        </w:rPr>
-        <w:t xml:space="preserve">, asigurând o precizie ridicată cu o toleranță maximă de 2° între valorile programate și cele efective. </w:t>
+        <w:t>-uri</w:t>
+      </w:r>
+      <w:r>
+        <w:rPr>
+          <w:rFonts w:ascii="Times New Roman" w:hAnsi="Times New Roman" w:cs="Times New Roman"/>
+          <w:sz w:val="24"/>
+        </w:rPr>
+        <w:fldChar w:fldCharType="end"/>
+      </w:r>
+      <w:r>
+        <w:rPr>
+          <w:rFonts w:ascii="Times New Roman" w:hAnsi="Times New Roman" w:cs="Times New Roman"/>
+          <w:sz w:val="24"/>
+        </w:rPr>
+        <w:t>]</w:t>
+      </w:r>
+      <w:r>
+        <w:rPr>
+          <w:rFonts w:ascii="Times New Roman" w:hAnsi="Times New Roman" w:cs="Times New Roman"/>
+          <w:sz w:val="24"/>
+        </w:rPr>
+        <w:t xml:space="preserve">. </w:t>
       </w:r>
     </w:p>
     <w:p>
@@ -49825,7 +49727,21 @@
           <w:rFonts w:ascii="Times New Roman" w:hAnsi="Times New Roman" w:cs="Times New Roman"/>
           <w:sz w:val="24"/>
         </w:rPr>
-        <w:t>Arhitectura este concepută pentru a fi modulară și scalabilă, facilitând integrarea ulterioară de noi senzori sau unități de execuție fără restructurarea nucleului software. Schimbul de date între interfața web și ESP32 utilizează mesaje standardizate în format JSON, asigurând o interoperabilitate ridicată și stabilitate în extinderea funcționalităților sistemului fără a compromite resursele de calcul disponibile.</w:t>
+        <w:t>Arhitectura este concepută pentru a fi modulară și scalabilă, facilitând integrarea ulterioară de noi senzori sau unități de execuție fără restructurarea nucleului software. Schimbul de date între interfața web și ESP32, asigur</w:t>
+      </w:r>
+      <w:r>
+        <w:rPr>
+          <w:rFonts w:ascii="Times New Roman" w:hAnsi="Times New Roman" w:cs="Times New Roman"/>
+          <w:sz w:val="24"/>
+        </w:rPr>
+        <w:t>ă</w:t>
+      </w:r>
+      <w:r>
+        <w:rPr>
+          <w:rFonts w:ascii="Times New Roman" w:hAnsi="Times New Roman" w:cs="Times New Roman"/>
+          <w:sz w:val="24"/>
+        </w:rPr>
+        <w:t xml:space="preserve"> o interoperabilitate ridicată și stabilitate în extinderea funcționalităților sistemului fără a compromite resursele de calcul disponibile.</w:t>
       </w:r>
     </w:p>
     <w:p>
@@ -49840,7 +49756,7 @@
           <w:szCs w:val="28"/>
         </w:rPr>
       </w:pPr>
-      <w:bookmarkStart w:id="15" w:name="_Toc223943455"/>
+      <w:bookmarkStart w:id="20" w:name="_Toc223944577"/>
       <w:r>
         <w:rPr>
           <w:rFonts w:ascii="Times New Roman" w:hAnsi="Times New Roman" w:cs="Times New Roman"/>
@@ -49883,7 +49799,7 @@
         </w:rPr>
         <w:t xml:space="preserve"> / stabilitate conexiune)</w:t>
       </w:r>
-      <w:bookmarkEnd w:id="15"/>
+      <w:bookmarkEnd w:id="20"/>
     </w:p>
     <w:p>
       <w:pPr>
@@ -49897,7 +49813,7 @@
           <w:szCs w:val="28"/>
         </w:rPr>
       </w:pPr>
-      <w:bookmarkStart w:id="16" w:name="_Toc223943456"/>
+      <w:bookmarkStart w:id="21" w:name="_Toc223944578"/>
       <w:r>
         <w:rPr>
           <w:rFonts w:ascii="Times New Roman" w:hAnsi="Times New Roman" w:cs="Times New Roman"/>
@@ -49940,7 +49856,32 @@
         </w:rPr>
         <w:t>))</w:t>
       </w:r>
-      <w:bookmarkEnd w:id="16"/>
+      <w:bookmarkEnd w:id="21"/>
+    </w:p>
+    <w:p>
+      <w:pPr>
+        <w:spacing w:line="312" w:lineRule="auto"/>
+      </w:pPr>
+    </w:p>
+    <w:p>
+      <w:pPr>
+        <w:spacing w:line="312" w:lineRule="auto"/>
+      </w:pPr>
+    </w:p>
+    <w:p>
+      <w:pPr>
+        <w:spacing w:line="312" w:lineRule="auto"/>
+      </w:pPr>
+    </w:p>
+    <w:p>
+      <w:pPr>
+        <w:spacing w:line="312" w:lineRule="auto"/>
+      </w:pPr>
+    </w:p>
+    <w:p>
+      <w:pPr>
+        <w:spacing w:line="312" w:lineRule="auto"/>
+      </w:pPr>
     </w:p>
     <w:p>
       <w:pPr>
@@ -49994,7 +49935,7 @@
           <w:szCs w:val="36"/>
         </w:rPr>
       </w:pPr>
-      <w:bookmarkStart w:id="17" w:name="_Toc223943457"/>
+      <w:bookmarkStart w:id="22" w:name="_Toc223944579"/>
       <w:r>
         <w:rPr>
           <w:rFonts w:ascii="Times New Roman" w:hAnsi="Times New Roman" w:cs="Times New Roman"/>
@@ -50006,7 +49947,7 @@
         <w:lastRenderedPageBreak/>
         <w:t>Capitolul 5. Implementare hardware</w:t>
       </w:r>
-      <w:bookmarkEnd w:id="17"/>
+      <w:bookmarkEnd w:id="22"/>
     </w:p>
     <w:p/>
     <w:p/>
@@ -50040,7 +49981,7 @@
           <w:szCs w:val="36"/>
         </w:rPr>
       </w:pPr>
-      <w:bookmarkStart w:id="18" w:name="_Toc223943458"/>
+      <w:bookmarkStart w:id="23" w:name="_Toc223944580"/>
       <w:r>
         <w:rPr>
           <w:rFonts w:ascii="Times New Roman" w:hAnsi="Times New Roman" w:cs="Times New Roman"/>
@@ -50072,7 +50013,7 @@
         </w:rPr>
         <w:t>. Implementare software</w:t>
       </w:r>
-      <w:bookmarkEnd w:id="18"/>
+      <w:bookmarkEnd w:id="23"/>
     </w:p>
     <w:p>
       <w:pPr>
@@ -50086,7 +50027,7 @@
           <w:szCs w:val="28"/>
         </w:rPr>
       </w:pPr>
-      <w:bookmarkStart w:id="19" w:name="_Toc223943459"/>
+      <w:bookmarkStart w:id="24" w:name="_Toc223944581"/>
       <w:r>
         <w:rPr>
           <w:rFonts w:ascii="Times New Roman" w:hAnsi="Times New Roman" w:cs="Times New Roman"/>
@@ -50117,7 +50058,7 @@
         </w:rPr>
         <w:t>Structura generală a aplicației</w:t>
       </w:r>
-      <w:bookmarkEnd w:id="19"/>
+      <w:bookmarkEnd w:id="24"/>
     </w:p>
     <w:p>
       <w:pPr>
@@ -50131,7 +50072,7 @@
           <w:szCs w:val="28"/>
         </w:rPr>
       </w:pPr>
-      <w:bookmarkStart w:id="20" w:name="_Toc223943460"/>
+      <w:bookmarkStart w:id="25" w:name="_Toc223944582"/>
       <w:r>
         <w:rPr>
           <w:rFonts w:ascii="Times New Roman" w:hAnsi="Times New Roman" w:cs="Times New Roman"/>
@@ -50152,7 +50093,7 @@
         </w:rPr>
         <w:t>.2. Implementarea serverului web asincron</w:t>
       </w:r>
-      <w:bookmarkEnd w:id="20"/>
+      <w:bookmarkEnd w:id="25"/>
     </w:p>
     <w:p>
       <w:pPr>
@@ -50166,7 +50107,7 @@
           <w:szCs w:val="28"/>
         </w:rPr>
       </w:pPr>
-      <w:bookmarkStart w:id="21" w:name="_Toc223943461"/>
+      <w:bookmarkStart w:id="26" w:name="_Toc223944583"/>
       <w:r>
         <w:rPr>
           <w:rFonts w:ascii="Times New Roman" w:hAnsi="Times New Roman" w:cs="Times New Roman"/>
@@ -50187,7 +50128,7 @@
         </w:rPr>
         <w:t>.3. Controlul servomotoarelor</w:t>
       </w:r>
-      <w:bookmarkEnd w:id="21"/>
+      <w:bookmarkEnd w:id="26"/>
     </w:p>
     <w:p>
       <w:pPr>
@@ -50202,7 +50143,7 @@
           <w:lang w:val="en-US"/>
         </w:rPr>
       </w:pPr>
-      <w:bookmarkStart w:id="22" w:name="_Toc223943462"/>
+      <w:bookmarkStart w:id="27" w:name="_Toc223944584"/>
       <w:r>
         <w:rPr>
           <w:rFonts w:ascii="Times New Roman" w:hAnsi="Times New Roman" w:cs="Times New Roman"/>
@@ -50297,7 +50238,7 @@
         </w:rPr>
         <w:t xml:space="preserve"> backend</w:t>
       </w:r>
-      <w:bookmarkEnd w:id="22"/>
+      <w:bookmarkEnd w:id="27"/>
     </w:p>
     <w:p>
       <w:pPr>
@@ -50311,7 +50252,7 @@
           <w:szCs w:val="28"/>
         </w:rPr>
       </w:pPr>
-      <w:bookmarkStart w:id="23" w:name="_Toc223943463"/>
+      <w:bookmarkStart w:id="28" w:name="_Toc223944585"/>
       <w:r>
         <w:rPr>
           <w:rFonts w:ascii="Times New Roman" w:hAnsi="Times New Roman" w:cs="Times New Roman"/>
@@ -50462,7 +50403,7 @@
         </w:rPr>
         <w:t>JavaScript</w:t>
       </w:r>
-      <w:bookmarkEnd w:id="23"/>
+      <w:bookmarkEnd w:id="28"/>
       <w:proofErr w:type="spellEnd"/>
       <w:r>
         <w:rPr>
@@ -50652,7 +50593,7 @@
           <w:szCs w:val="36"/>
         </w:rPr>
       </w:pPr>
-      <w:bookmarkStart w:id="24" w:name="_Toc223943464"/>
+      <w:bookmarkStart w:id="29" w:name="_Toc223944586"/>
       <w:proofErr w:type="spellStart"/>
       <w:r>
         <w:rPr>
@@ -50710,7 +50651,7 @@
         </w:rPr>
         <w:t>Testare și validare</w:t>
       </w:r>
-      <w:bookmarkEnd w:id="24"/>
+      <w:bookmarkEnd w:id="29"/>
     </w:p>
     <w:p>
       <w:pPr>
@@ -50724,7 +50665,7 @@
           <w:szCs w:val="28"/>
         </w:rPr>
       </w:pPr>
-      <w:bookmarkStart w:id="25" w:name="_Toc223943465"/>
+      <w:bookmarkStart w:id="30" w:name="_Toc223944587"/>
       <w:r>
         <w:rPr>
           <w:rFonts w:ascii="Times New Roman" w:hAnsi="Times New Roman" w:cs="Times New Roman"/>
@@ -50745,7 +50686,7 @@
         </w:rPr>
         <w:t>.1. Testare funcțională</w:t>
       </w:r>
-      <w:bookmarkEnd w:id="25"/>
+      <w:bookmarkEnd w:id="30"/>
     </w:p>
     <w:p>
       <w:pPr>
@@ -50759,7 +50700,7 @@
           <w:szCs w:val="28"/>
         </w:rPr>
       </w:pPr>
-      <w:bookmarkStart w:id="26" w:name="_Toc223943466"/>
+      <w:bookmarkStart w:id="31" w:name="_Toc223944588"/>
       <w:r>
         <w:rPr>
           <w:rFonts w:ascii="Times New Roman" w:hAnsi="Times New Roman" w:cs="Times New Roman"/>
@@ -50790,7 +50731,7 @@
         </w:rPr>
         <w:t>, stres, rezultate</w:t>
       </w:r>
-      <w:bookmarkEnd w:id="26"/>
+      <w:bookmarkEnd w:id="31"/>
     </w:p>
     <w:p>
       <w:pPr>
@@ -50963,7 +50904,7 @@
           <w:szCs w:val="36"/>
         </w:rPr>
       </w:pPr>
-      <w:bookmarkStart w:id="27" w:name="_Toc223943467"/>
+      <w:bookmarkStart w:id="32" w:name="_Toc223944589"/>
       <w:r>
         <w:rPr>
           <w:rFonts w:ascii="Times New Roman" w:hAnsi="Times New Roman" w:cs="Times New Roman"/>
@@ -50975,7 +50916,7 @@
         <w:lastRenderedPageBreak/>
         <w:t>Concluzii</w:t>
       </w:r>
-      <w:bookmarkEnd w:id="27"/>
+      <w:bookmarkEnd w:id="32"/>
     </w:p>
     <w:p>
       <w:pPr>
@@ -51098,7 +51039,7 @@
         <w:spacing w:after="311" w:line="312" w:lineRule="auto"/>
         <w:ind w:left="-5"/>
       </w:pPr>
-      <w:bookmarkStart w:id="28" w:name="_Toc223943468"/>
+      <w:bookmarkStart w:id="33" w:name="_Toc223944590"/>
       <w:r>
         <w:rPr>
           <w:rFonts w:ascii="Times New Roman" w:hAnsi="Times New Roman" w:cs="Times New Roman"/>
@@ -51110,7 +51051,7 @@
         <w:lastRenderedPageBreak/>
         <w:t>Bibliografie</w:t>
       </w:r>
-      <w:bookmarkEnd w:id="28"/>
+      <w:bookmarkEnd w:id="33"/>
       <w:r>
         <w:t xml:space="preserve"> </w:t>
       </w:r>
@@ -51127,7 +51068,7 @@
           <w:lang w:val="en-US"/>
         </w:rPr>
       </w:pPr>
-      <w:bookmarkStart w:id="29" w:name="_Ref223599202"/>
+      <w:bookmarkStart w:id="34" w:name="_Ref223599202"/>
       <w:r>
         <w:t xml:space="preserve">ESP32 </w:t>
       </w:r>
@@ -51184,7 +51125,7 @@
       <w:r>
         <w:t>)</w:t>
       </w:r>
-      <w:bookmarkEnd w:id="29"/>
+      <w:bookmarkEnd w:id="34"/>
       <w:r>
         <w:t>.</w:t>
       </w:r>
@@ -51204,7 +51145,7 @@
           <w:lang w:val="en-US"/>
         </w:rPr>
       </w:pPr>
-      <w:bookmarkStart w:id="30" w:name="_Ref223678309"/>
+      <w:bookmarkStart w:id="35" w:name="_Ref223678309"/>
       <w:r>
         <w:t xml:space="preserve">ESP32 </w:t>
       </w:r>
@@ -51261,7 +51202,7 @@
       <w:r>
         <w:t>.</w:t>
       </w:r>
-      <w:bookmarkEnd w:id="30"/>
+      <w:bookmarkEnd w:id="35"/>
       <w:r>
         <w:t xml:space="preserve"> </w:t>
       </w:r>
@@ -51377,7 +51318,7 @@
           <w:lang w:val="en-US"/>
         </w:rPr>
       </w:pPr>
-      <w:bookmarkStart w:id="31" w:name="_Ref223425662"/>
+      <w:bookmarkStart w:id="36" w:name="_Ref223425662"/>
       <w:proofErr w:type="spellStart"/>
       <w:r>
         <w:t>She</w:t>
@@ -51521,7 +51462,7 @@
       <w:r>
         <w:t>, (data accesării: 03.03.2026)</w:t>
       </w:r>
-      <w:bookmarkEnd w:id="31"/>
+      <w:bookmarkEnd w:id="36"/>
       <w:r>
         <w:t>.</w:t>
       </w:r>
@@ -51538,7 +51479,7 @@
           <w:lang w:val="en-US"/>
         </w:rPr>
       </w:pPr>
-      <w:bookmarkStart w:id="32" w:name="_Ref223425876"/>
+      <w:bookmarkStart w:id="37" w:name="_Ref223425876"/>
       <w:r>
         <w:t>Yang H</w:t>
       </w:r>
@@ -51695,7 +51636,7 @@
       <w:r>
         <w:t>, (data accesării: 03.03.2026)</w:t>
       </w:r>
-      <w:bookmarkEnd w:id="32"/>
+      <w:bookmarkEnd w:id="37"/>
       <w:r>
         <w:t>.</w:t>
       </w:r>
@@ -51712,7 +51653,7 @@
           <w:lang w:val="en-US"/>
         </w:rPr>
       </w:pPr>
-      <w:bookmarkStart w:id="33" w:name="_Ref223426014"/>
+      <w:bookmarkStart w:id="38" w:name="_Ref223426014"/>
       <w:proofErr w:type="spellStart"/>
       <w:r>
         <w:t>Butterfaß</w:t>
@@ -51850,7 +51791,7 @@
       <w:r>
         <w:t>, (data accesării: 03.03.2026)</w:t>
       </w:r>
-      <w:bookmarkEnd w:id="33"/>
+      <w:bookmarkEnd w:id="38"/>
       <w:r>
         <w:t>.</w:t>
       </w:r>
@@ -51867,7 +51808,7 @@
           <w:lang w:val="en-US"/>
         </w:rPr>
       </w:pPr>
-      <w:bookmarkStart w:id="34" w:name="_Ref223426693"/>
+      <w:bookmarkStart w:id="39" w:name="_Ref223426693"/>
       <w:r>
         <w:t>Johannes MS</w:t>
       </w:r>
@@ -52023,7 +51964,7 @@
       <w:r>
         <w:t>, (data accesării: 04.03.2026)</w:t>
       </w:r>
-      <w:bookmarkEnd w:id="34"/>
+      <w:bookmarkEnd w:id="39"/>
       <w:r>
         <w:t>.</w:t>
       </w:r>
@@ -52040,7 +51981,7 @@
           <w:lang w:val="en-US"/>
         </w:rPr>
       </w:pPr>
-      <w:bookmarkStart w:id="35" w:name="_Ref223426984"/>
+      <w:bookmarkStart w:id="40" w:name="_Ref223426984"/>
       <w:r>
         <w:rPr>
           <w:lang w:val="en-US"/>
@@ -52165,7 +52106,7 @@
       <w:r>
         <w:t>(data accesării: 04.03.2026)</w:t>
       </w:r>
-      <w:bookmarkEnd w:id="35"/>
+      <w:bookmarkEnd w:id="40"/>
       <w:r>
         <w:t>.</w:t>
       </w:r>
@@ -52182,7 +52123,7 @@
           <w:lang w:val="en-US"/>
         </w:rPr>
       </w:pPr>
-      <w:bookmarkStart w:id="36" w:name="_Ref223427381"/>
+      <w:bookmarkStart w:id="41" w:name="_Ref223427381"/>
       <w:proofErr w:type="spellStart"/>
       <w:r>
         <w:rPr>
@@ -52309,7 +52250,7 @@
         </w:rPr>
         <w:t>)</w:t>
       </w:r>
-      <w:bookmarkEnd w:id="36"/>
+      <w:bookmarkEnd w:id="41"/>
       <w:r>
         <w:rPr>
           <w:lang w:val="en-US"/>
@@ -52359,7 +52300,7 @@
         <w:spacing w:after="311" w:line="312" w:lineRule="auto"/>
         <w:ind w:left="-5"/>
       </w:pPr>
-      <w:bookmarkStart w:id="37" w:name="_Toc223943469"/>
+      <w:bookmarkStart w:id="42" w:name="_Toc223944591"/>
       <w:r>
         <w:rPr>
           <w:rFonts w:ascii="Times New Roman" w:hAnsi="Times New Roman" w:cs="Times New Roman"/>
@@ -52371,7 +52312,7 @@
         <w:lastRenderedPageBreak/>
         <w:t>Anexe</w:t>
       </w:r>
-      <w:bookmarkEnd w:id="37"/>
+      <w:bookmarkEnd w:id="42"/>
       <w:r>
         <w:t xml:space="preserve"> </w:t>
       </w:r>

</xml_diff>

<commit_message>
Some more doc on chapter 4 still needs to be done
</commit_message>
<xml_diff>
--- a/lic.docx
+++ b/lic.docx
@@ -613,7 +613,7 @@
           <w:r>
             <w:fldChar w:fldCharType="separate"/>
           </w:r>
-          <w:hyperlink w:anchor="_Toc223944564" w:history="1">
+          <w:hyperlink w:anchor="_Toc223945563" w:history="1">
             <w:r>
               <w:rPr>
                 <w:rStyle w:val="Hyperlink"/>
@@ -643,7 +643,7 @@
                 <w:noProof/>
                 <w:webHidden/>
               </w:rPr>
-              <w:instrText xml:space="preserve"> PAGEREF _Toc223944564 \h </w:instrText>
+              <w:instrText xml:space="preserve"> PAGEREF _Toc223945563 \h </w:instrText>
             </w:r>
             <w:r>
               <w:rPr>
@@ -688,7 +688,7 @@
               <w:lang w:val="en-US"/>
             </w:rPr>
           </w:pPr>
-          <w:hyperlink w:anchor="_Toc223944565" w:history="1">
+          <w:hyperlink w:anchor="_Toc223945564" w:history="1">
             <w:r>
               <w:rPr>
                 <w:rStyle w:val="Hyperlink"/>
@@ -718,7 +718,7 @@
                 <w:noProof/>
                 <w:webHidden/>
               </w:rPr>
-              <w:instrText xml:space="preserve"> PAGEREF _Toc223944565 \h </w:instrText>
+              <w:instrText xml:space="preserve"> PAGEREF _Toc223945564 \h </w:instrText>
             </w:r>
             <w:r>
               <w:rPr>
@@ -765,7 +765,7 @@
               <w14:ligatures w14:val="standardContextual"/>
             </w:rPr>
           </w:pPr>
-          <w:hyperlink w:anchor="_Toc223944566" w:history="1">
+          <w:hyperlink w:anchor="_Toc223945565" w:history="1">
             <w:r>
               <w:rPr>
                 <w:rStyle w:val="Hyperlink"/>
@@ -795,7 +795,7 @@
                 <w:noProof/>
                 <w:webHidden/>
               </w:rPr>
-              <w:instrText xml:space="preserve"> PAGEREF _Toc223944566 \h </w:instrText>
+              <w:instrText xml:space="preserve"> PAGEREF _Toc223945565 \h </w:instrText>
             </w:r>
             <w:r>
               <w:rPr>
@@ -842,7 +842,7 @@
               <w14:ligatures w14:val="standardContextual"/>
             </w:rPr>
           </w:pPr>
-          <w:hyperlink w:anchor="_Toc223944567" w:history="1">
+          <w:hyperlink w:anchor="_Toc223945566" w:history="1">
             <w:r>
               <w:rPr>
                 <w:rStyle w:val="Hyperlink"/>
@@ -872,7 +872,7 @@
                 <w:noProof/>
                 <w:webHidden/>
               </w:rPr>
-              <w:instrText xml:space="preserve"> PAGEREF _Toc223944567 \h </w:instrText>
+              <w:instrText xml:space="preserve"> PAGEREF _Toc223945566 \h </w:instrText>
             </w:r>
             <w:r>
               <w:rPr>
@@ -917,7 +917,7 @@
               <w:lang w:val="en-US"/>
             </w:rPr>
           </w:pPr>
-          <w:hyperlink w:anchor="_Toc223944568" w:history="1">
+          <w:hyperlink w:anchor="_Toc223945567" w:history="1">
             <w:r>
               <w:rPr>
                 <w:rStyle w:val="Hyperlink"/>
@@ -947,7 +947,7 @@
                 <w:noProof/>
                 <w:webHidden/>
               </w:rPr>
-              <w:instrText xml:space="preserve"> PAGEREF _Toc223944568 \h </w:instrText>
+              <w:instrText xml:space="preserve"> PAGEREF _Toc223945567 \h </w:instrText>
             </w:r>
             <w:r>
               <w:rPr>
@@ -994,7 +994,7 @@
               <w14:ligatures w14:val="standardContextual"/>
             </w:rPr>
           </w:pPr>
-          <w:hyperlink w:anchor="_Toc223944569" w:history="1">
+          <w:hyperlink w:anchor="_Toc223945568" w:history="1">
             <w:r>
               <w:rPr>
                 <w:rStyle w:val="Hyperlink"/>
@@ -1024,7 +1024,7 @@
                 <w:noProof/>
                 <w:webHidden/>
               </w:rPr>
-              <w:instrText xml:space="preserve"> PAGEREF _Toc223944569 \h </w:instrText>
+              <w:instrText xml:space="preserve"> PAGEREF _Toc223945568 \h </w:instrText>
             </w:r>
             <w:r>
               <w:rPr>
@@ -1071,7 +1071,7 @@
               <w14:ligatures w14:val="standardContextual"/>
             </w:rPr>
           </w:pPr>
-          <w:hyperlink w:anchor="_Toc223944570" w:history="1">
+          <w:hyperlink w:anchor="_Toc223945569" w:history="1">
             <w:r>
               <w:rPr>
                 <w:rStyle w:val="Hyperlink"/>
@@ -1101,7 +1101,7 @@
                 <w:noProof/>
                 <w:webHidden/>
               </w:rPr>
-              <w:instrText xml:space="preserve"> PAGEREF _Toc223944570 \h </w:instrText>
+              <w:instrText xml:space="preserve"> PAGEREF _Toc223945569 \h </w:instrText>
             </w:r>
             <w:r>
               <w:rPr>
@@ -1146,7 +1146,7 @@
               <w:lang w:val="en-US"/>
             </w:rPr>
           </w:pPr>
-          <w:hyperlink w:anchor="_Toc223944571" w:history="1">
+          <w:hyperlink w:anchor="_Toc223945570" w:history="1">
             <w:r>
               <w:rPr>
                 <w:rStyle w:val="Hyperlink"/>
@@ -1176,7 +1176,7 @@
                 <w:noProof/>
                 <w:webHidden/>
               </w:rPr>
-              <w:instrText xml:space="preserve"> PAGEREF _Toc223944571 \h </w:instrText>
+              <w:instrText xml:space="preserve"> PAGEREF _Toc223945570 \h </w:instrText>
             </w:r>
             <w:r>
               <w:rPr>
@@ -1223,7 +1223,7 @@
               <w14:ligatures w14:val="standardContextual"/>
             </w:rPr>
           </w:pPr>
-          <w:hyperlink w:anchor="_Toc223944572" w:history="1">
+          <w:hyperlink w:anchor="_Toc223945571" w:history="1">
             <w:r>
               <w:rPr>
                 <w:rStyle w:val="Hyperlink"/>
@@ -1274,7 +1274,7 @@
                 <w:noProof/>
                 <w:webHidden/>
               </w:rPr>
-              <w:instrText xml:space="preserve"> PAGEREF _Toc223944572 \h </w:instrText>
+              <w:instrText xml:space="preserve"> PAGEREF _Toc223945571 \h </w:instrText>
             </w:r>
             <w:r>
               <w:rPr>
@@ -1321,7 +1321,7 @@
               <w14:ligatures w14:val="standardContextual"/>
             </w:rPr>
           </w:pPr>
-          <w:hyperlink w:anchor="_Toc223944573" w:history="1">
+          <w:hyperlink w:anchor="_Toc223945572" w:history="1">
             <w:r>
               <w:rPr>
                 <w:rStyle w:val="Hyperlink"/>
@@ -1351,7 +1351,7 @@
                 <w:noProof/>
                 <w:webHidden/>
               </w:rPr>
-              <w:instrText xml:space="preserve"> PAGEREF _Toc223944573 \h </w:instrText>
+              <w:instrText xml:space="preserve"> PAGEREF _Toc223945572 \h </w:instrText>
             </w:r>
             <w:r>
               <w:rPr>
@@ -1398,7 +1398,7 @@
               <w14:ligatures w14:val="standardContextual"/>
             </w:rPr>
           </w:pPr>
-          <w:hyperlink w:anchor="_Toc223944574" w:history="1">
+          <w:hyperlink w:anchor="_Toc223945573" w:history="1">
             <w:r>
               <w:rPr>
                 <w:rStyle w:val="Hyperlink"/>
@@ -1428,7 +1428,7 @@
                 <w:noProof/>
                 <w:webHidden/>
               </w:rPr>
-              <w:instrText xml:space="preserve"> PAGEREF _Toc223944574 \h </w:instrText>
+              <w:instrText xml:space="preserve"> PAGEREF _Toc223945573 \h </w:instrText>
             </w:r>
             <w:r>
               <w:rPr>
@@ -1473,7 +1473,7 @@
               <w:lang w:val="en-US"/>
             </w:rPr>
           </w:pPr>
-          <w:hyperlink w:anchor="_Toc223944575" w:history="1">
+          <w:hyperlink w:anchor="_Toc223945574" w:history="1">
             <w:r>
               <w:rPr>
                 <w:rStyle w:val="Hyperlink"/>
@@ -1503,7 +1503,7 @@
                 <w:noProof/>
                 <w:webHidden/>
               </w:rPr>
-              <w:instrText xml:space="preserve"> PAGEREF _Toc223944575 \h </w:instrText>
+              <w:instrText xml:space="preserve"> PAGEREF _Toc223945574 \h </w:instrText>
             </w:r>
             <w:r>
               <w:rPr>
@@ -1550,7 +1550,7 @@
               <w14:ligatures w14:val="standardContextual"/>
             </w:rPr>
           </w:pPr>
-          <w:hyperlink w:anchor="_Toc223944576" w:history="1">
+          <w:hyperlink w:anchor="_Toc223945575" w:history="1">
             <w:r>
               <w:rPr>
                 <w:rStyle w:val="Hyperlink"/>
@@ -1580,7 +1580,7 @@
                 <w:noProof/>
                 <w:webHidden/>
               </w:rPr>
-              <w:instrText xml:space="preserve"> PAGEREF _Toc223944576 \h </w:instrText>
+              <w:instrText xml:space="preserve"> PAGEREF _Toc223945575 \h </w:instrText>
             </w:r>
             <w:r>
               <w:rPr>
@@ -1627,7 +1627,7 @@
               <w14:ligatures w14:val="standardContextual"/>
             </w:rPr>
           </w:pPr>
-          <w:hyperlink w:anchor="_Toc223944577" w:history="1">
+          <w:hyperlink w:anchor="_Toc223945576" w:history="1">
             <w:r>
               <w:rPr>
                 <w:rStyle w:val="Hyperlink"/>
@@ -1657,7 +1657,7 @@
                 <w:noProof/>
                 <w:webHidden/>
               </w:rPr>
-              <w:instrText xml:space="preserve"> PAGEREF _Toc223944577 \h </w:instrText>
+              <w:instrText xml:space="preserve"> PAGEREF _Toc223945576 \h </w:instrText>
             </w:r>
             <w:r>
               <w:rPr>
@@ -1704,7 +1704,7 @@
               <w14:ligatures w14:val="standardContextual"/>
             </w:rPr>
           </w:pPr>
-          <w:hyperlink w:anchor="_Toc223944578" w:history="1">
+          <w:hyperlink w:anchor="_Toc223945577" w:history="1">
             <w:r>
               <w:rPr>
                 <w:rStyle w:val="Hyperlink"/>
@@ -1713,7 +1713,7 @@
                 <w:bCs/>
                 <w:noProof/>
               </w:rPr>
-              <w:t>4.3. Arhitectura generală a sistemului (flux de date (browser -&gt; esp32 -&gt; servo))</w:t>
+              <w:t>4.3. Arhitectura generală a sistemului (flux de date (user -&gt; browser -&gt; esp32 -&gt; servo))</w:t>
             </w:r>
             <w:r>
               <w:rPr>
@@ -1734,7 +1734,7 @@
                 <w:noProof/>
                 <w:webHidden/>
               </w:rPr>
-              <w:instrText xml:space="preserve"> PAGEREF _Toc223944578 \h </w:instrText>
+              <w:instrText xml:space="preserve"> PAGEREF _Toc223945577 \h </w:instrText>
             </w:r>
             <w:r>
               <w:rPr>
@@ -1779,7 +1779,7 @@
               <w:lang w:val="en-US"/>
             </w:rPr>
           </w:pPr>
-          <w:hyperlink w:anchor="_Toc223944579" w:history="1">
+          <w:hyperlink w:anchor="_Toc223945578" w:history="1">
             <w:r>
               <w:rPr>
                 <w:rStyle w:val="Hyperlink"/>
@@ -1809,7 +1809,7 @@
                 <w:noProof/>
                 <w:webHidden/>
               </w:rPr>
-              <w:instrText xml:space="preserve"> PAGEREF _Toc223944579 \h </w:instrText>
+              <w:instrText xml:space="preserve"> PAGEREF _Toc223945578 \h </w:instrText>
             </w:r>
             <w:r>
               <w:rPr>
@@ -1854,7 +1854,7 @@
               <w:lang w:val="en-US"/>
             </w:rPr>
           </w:pPr>
-          <w:hyperlink w:anchor="_Toc223944580" w:history="1">
+          <w:hyperlink w:anchor="_Toc223945579" w:history="1">
             <w:r>
               <w:rPr>
                 <w:rStyle w:val="Hyperlink"/>
@@ -1884,7 +1884,7 @@
                 <w:noProof/>
                 <w:webHidden/>
               </w:rPr>
-              <w:instrText xml:space="preserve"> PAGEREF _Toc223944580 \h </w:instrText>
+              <w:instrText xml:space="preserve"> PAGEREF _Toc223945579 \h </w:instrText>
             </w:r>
             <w:r>
               <w:rPr>
@@ -1931,7 +1931,7 @@
               <w14:ligatures w14:val="standardContextual"/>
             </w:rPr>
           </w:pPr>
-          <w:hyperlink w:anchor="_Toc223944581" w:history="1">
+          <w:hyperlink w:anchor="_Toc223945580" w:history="1">
             <w:r>
               <w:rPr>
                 <w:rStyle w:val="Hyperlink"/>
@@ -1961,7 +1961,7 @@
                 <w:noProof/>
                 <w:webHidden/>
               </w:rPr>
-              <w:instrText xml:space="preserve"> PAGEREF _Toc223944581 \h </w:instrText>
+              <w:instrText xml:space="preserve"> PAGEREF _Toc223945580 \h </w:instrText>
             </w:r>
             <w:r>
               <w:rPr>
@@ -2008,7 +2008,7 @@
               <w14:ligatures w14:val="standardContextual"/>
             </w:rPr>
           </w:pPr>
-          <w:hyperlink w:anchor="_Toc223944582" w:history="1">
+          <w:hyperlink w:anchor="_Toc223945581" w:history="1">
             <w:r>
               <w:rPr>
                 <w:rStyle w:val="Hyperlink"/>
@@ -2038,7 +2038,7 @@
                 <w:noProof/>
                 <w:webHidden/>
               </w:rPr>
-              <w:instrText xml:space="preserve"> PAGEREF _Toc223944582 \h </w:instrText>
+              <w:instrText xml:space="preserve"> PAGEREF _Toc223945581 \h </w:instrText>
             </w:r>
             <w:r>
               <w:rPr>
@@ -2085,7 +2085,7 @@
               <w14:ligatures w14:val="standardContextual"/>
             </w:rPr>
           </w:pPr>
-          <w:hyperlink w:anchor="_Toc223944583" w:history="1">
+          <w:hyperlink w:anchor="_Toc223945582" w:history="1">
             <w:r>
               <w:rPr>
                 <w:rStyle w:val="Hyperlink"/>
@@ -2115,7 +2115,7 @@
                 <w:noProof/>
                 <w:webHidden/>
               </w:rPr>
-              <w:instrText xml:space="preserve"> PAGEREF _Toc223944583 \h </w:instrText>
+              <w:instrText xml:space="preserve"> PAGEREF _Toc223945582 \h </w:instrText>
             </w:r>
             <w:r>
               <w:rPr>
@@ -2162,7 +2162,7 @@
               <w14:ligatures w14:val="standardContextual"/>
             </w:rPr>
           </w:pPr>
-          <w:hyperlink w:anchor="_Toc223944584" w:history="1">
+          <w:hyperlink w:anchor="_Toc223945583" w:history="1">
             <w:r>
               <w:rPr>
                 <w:rStyle w:val="Hyperlink"/>
@@ -2193,7 +2193,7 @@
                 <w:noProof/>
                 <w:webHidden/>
               </w:rPr>
-              <w:instrText xml:space="preserve"> PAGEREF _Toc223944584 \h </w:instrText>
+              <w:instrText xml:space="preserve"> PAGEREF _Toc223945583 \h </w:instrText>
             </w:r>
             <w:r>
               <w:rPr>
@@ -2240,7 +2240,7 @@
               <w14:ligatures w14:val="standardContextual"/>
             </w:rPr>
           </w:pPr>
-          <w:hyperlink w:anchor="_Toc223944585" w:history="1">
+          <w:hyperlink w:anchor="_Toc223945584" w:history="1">
             <w:r>
               <w:rPr>
                 <w:rStyle w:val="Hyperlink"/>
@@ -2291,7 +2291,7 @@
                 <w:noProof/>
                 <w:webHidden/>
               </w:rPr>
-              <w:instrText xml:space="preserve"> PAGEREF _Toc223944585 \h </w:instrText>
+              <w:instrText xml:space="preserve"> PAGEREF _Toc223945584 \h </w:instrText>
             </w:r>
             <w:r>
               <w:rPr>
@@ -2336,7 +2336,7 @@
               <w:lang w:val="en-US"/>
             </w:rPr>
           </w:pPr>
-          <w:hyperlink w:anchor="_Toc223944586" w:history="1">
+          <w:hyperlink w:anchor="_Toc223945585" w:history="1">
             <w:r>
               <w:rPr>
                 <w:rStyle w:val="Hyperlink"/>
@@ -2377,7 +2377,7 @@
                 <w:noProof/>
                 <w:webHidden/>
               </w:rPr>
-              <w:instrText xml:space="preserve"> PAGEREF _Toc223944586 \h </w:instrText>
+              <w:instrText xml:space="preserve"> PAGEREF _Toc223945585 \h </w:instrText>
             </w:r>
             <w:r>
               <w:rPr>
@@ -2424,7 +2424,7 @@
               <w14:ligatures w14:val="standardContextual"/>
             </w:rPr>
           </w:pPr>
-          <w:hyperlink w:anchor="_Toc223944587" w:history="1">
+          <w:hyperlink w:anchor="_Toc223945586" w:history="1">
             <w:r>
               <w:rPr>
                 <w:rStyle w:val="Hyperlink"/>
@@ -2454,7 +2454,7 @@
                 <w:noProof/>
                 <w:webHidden/>
               </w:rPr>
-              <w:instrText xml:space="preserve"> PAGEREF _Toc223944587 \h </w:instrText>
+              <w:instrText xml:space="preserve"> PAGEREF _Toc223945586 \h </w:instrText>
             </w:r>
             <w:r>
               <w:rPr>
@@ -2501,7 +2501,7 @@
               <w14:ligatures w14:val="standardContextual"/>
             </w:rPr>
           </w:pPr>
-          <w:hyperlink w:anchor="_Toc223944588" w:history="1">
+          <w:hyperlink w:anchor="_Toc223945587" w:history="1">
             <w:r>
               <w:rPr>
                 <w:rStyle w:val="Hyperlink"/>
@@ -2531,7 +2531,7 @@
                 <w:noProof/>
                 <w:webHidden/>
               </w:rPr>
-              <w:instrText xml:space="preserve"> PAGEREF _Toc223944588 \h </w:instrText>
+              <w:instrText xml:space="preserve"> PAGEREF _Toc223945587 \h </w:instrText>
             </w:r>
             <w:r>
               <w:rPr>
@@ -2576,7 +2576,7 @@
               <w:lang w:val="en-US"/>
             </w:rPr>
           </w:pPr>
-          <w:hyperlink w:anchor="_Toc223944589" w:history="1">
+          <w:hyperlink w:anchor="_Toc223945588" w:history="1">
             <w:r>
               <w:rPr>
                 <w:rStyle w:val="Hyperlink"/>
@@ -2606,7 +2606,7 @@
                 <w:noProof/>
                 <w:webHidden/>
               </w:rPr>
-              <w:instrText xml:space="preserve"> PAGEREF _Toc223944589 \h </w:instrText>
+              <w:instrText xml:space="preserve"> PAGEREF _Toc223945588 \h </w:instrText>
             </w:r>
             <w:r>
               <w:rPr>
@@ -2651,7 +2651,7 @@
               <w:lang w:val="en-US"/>
             </w:rPr>
           </w:pPr>
-          <w:hyperlink w:anchor="_Toc223944590" w:history="1">
+          <w:hyperlink w:anchor="_Toc223945589" w:history="1">
             <w:r>
               <w:rPr>
                 <w:rStyle w:val="Hyperlink"/>
@@ -2681,7 +2681,7 @@
                 <w:noProof/>
                 <w:webHidden/>
               </w:rPr>
-              <w:instrText xml:space="preserve"> PAGEREF _Toc223944590 \h </w:instrText>
+              <w:instrText xml:space="preserve"> PAGEREF _Toc223945589 \h </w:instrText>
             </w:r>
             <w:r>
               <w:rPr>
@@ -2726,7 +2726,7 @@
               <w:lang w:val="en-US"/>
             </w:rPr>
           </w:pPr>
-          <w:hyperlink w:anchor="_Toc223944591" w:history="1">
+          <w:hyperlink w:anchor="_Toc223945590" w:history="1">
             <w:r>
               <w:rPr>
                 <w:rStyle w:val="Hyperlink"/>
@@ -2756,7 +2756,7 @@
                 <w:noProof/>
                 <w:webHidden/>
               </w:rPr>
-              <w:instrText xml:space="preserve"> PAGEREF _Toc223944591 \h </w:instrText>
+              <w:instrText xml:space="preserve"> PAGEREF _Toc223945590 \h </w:instrText>
             </w:r>
             <w:r>
               <w:rPr>
@@ -2850,7 +2850,7 @@
         <w:pStyle w:val="Heading1"/>
         <w:spacing w:before="0" w:after="0" w:line="312" w:lineRule="auto"/>
       </w:pPr>
-      <w:bookmarkStart w:id="1" w:name="_Toc223944564"/>
+      <w:bookmarkStart w:id="1" w:name="_Toc223945563"/>
       <w:r>
         <w:rPr>
           <w:rFonts w:ascii="Times New Roman" w:hAnsi="Times New Roman" w:cs="Times New Roman"/>
@@ -8766,7 +8766,7 @@
         </w:rPr>
       </w:pPr>
       <w:bookmarkStart w:id="2" w:name="_Toc13091"/>
-      <w:bookmarkStart w:id="3" w:name="_Toc223944565"/>
+      <w:bookmarkStart w:id="3" w:name="_Toc223945564"/>
       <w:r>
         <w:rPr>
           <w:rFonts w:ascii="Times New Roman" w:hAnsi="Times New Roman" w:cs="Times New Roman"/>
@@ -8916,7 +8916,7 @@
           <w:szCs w:val="28"/>
         </w:rPr>
       </w:pPr>
-      <w:bookmarkStart w:id="4" w:name="_Toc223944566"/>
+      <w:bookmarkStart w:id="4" w:name="_Toc223945565"/>
       <w:r>
         <w:rPr>
           <w:rFonts w:ascii="Times New Roman" w:hAnsi="Times New Roman" w:cs="Times New Roman"/>
@@ -12424,7 +12424,7 @@
           <w:szCs w:val="28"/>
         </w:rPr>
       </w:pPr>
-      <w:bookmarkStart w:id="5" w:name="_Toc223944567"/>
+      <w:bookmarkStart w:id="5" w:name="_Toc223945566"/>
       <w:r>
         <w:rPr>
           <w:rFonts w:ascii="Times New Roman" w:hAnsi="Times New Roman" w:cs="Times New Roman"/>
@@ -15794,7 +15794,7 @@
           <w:szCs w:val="36"/>
         </w:rPr>
       </w:pPr>
-      <w:bookmarkStart w:id="6" w:name="_Toc223944568"/>
+      <w:bookmarkStart w:id="6" w:name="_Toc223945567"/>
       <w:r>
         <w:rPr>
           <w:rFonts w:ascii="Times New Roman" w:hAnsi="Times New Roman" w:cs="Times New Roman"/>
@@ -15850,7 +15850,7 @@
           <w:szCs w:val="28"/>
         </w:rPr>
       </w:pPr>
-      <w:bookmarkStart w:id="7" w:name="_Toc223944569"/>
+      <w:bookmarkStart w:id="7" w:name="_Toc223945568"/>
       <w:r>
         <w:rPr>
           <w:rFonts w:ascii="Times New Roman" w:hAnsi="Times New Roman" w:cs="Times New Roman"/>
@@ -21775,7 +21775,7 @@
           <w:szCs w:val="28"/>
         </w:rPr>
       </w:pPr>
-      <w:bookmarkStart w:id="8" w:name="_Toc223944570"/>
+      <w:bookmarkStart w:id="8" w:name="_Toc223945569"/>
       <w:r>
         <w:rPr>
           <w:rFonts w:ascii="Times New Roman" w:hAnsi="Times New Roman" w:cs="Times New Roman"/>
@@ -29205,7 +29205,7 @@
           <w:szCs w:val="36"/>
         </w:rPr>
       </w:pPr>
-      <w:bookmarkStart w:id="9" w:name="_Toc223944571"/>
+      <w:bookmarkStart w:id="9" w:name="_Toc223945570"/>
       <w:r>
         <w:rPr>
           <w:rFonts w:ascii="Times New Roman" w:hAnsi="Times New Roman" w:cs="Times New Roman"/>
@@ -29273,7 +29273,7 @@
           <w:szCs w:val="28"/>
         </w:rPr>
       </w:pPr>
-      <w:bookmarkStart w:id="10" w:name="_Toc223944572"/>
+      <w:bookmarkStart w:id="10" w:name="_Toc223945571"/>
       <w:r>
         <w:rPr>
           <w:rFonts w:ascii="Times New Roman" w:hAnsi="Times New Roman" w:cs="Times New Roman"/>
@@ -36813,7 +36813,7 @@
       </w:pPr>
       <w:bookmarkStart w:id="11" w:name="_Ref223944058"/>
       <w:bookmarkStart w:id="12" w:name="_Ref223944065"/>
-      <w:bookmarkStart w:id="13" w:name="_Toc223944573"/>
+      <w:bookmarkStart w:id="13" w:name="_Toc223945572"/>
       <w:r>
         <w:rPr>
           <w:rFonts w:ascii="Times New Roman" w:hAnsi="Times New Roman" w:cs="Times New Roman"/>
@@ -41005,7 +41005,7 @@
       <w:bookmarkStart w:id="14" w:name="_Ref223943834"/>
       <w:bookmarkStart w:id="15" w:name="_Ref223943842"/>
       <w:bookmarkStart w:id="16" w:name="_Ref223943844"/>
-      <w:bookmarkStart w:id="17" w:name="_Toc223944574"/>
+      <w:bookmarkStart w:id="17" w:name="_Toc223945573"/>
       <w:r>
         <w:rPr>
           <w:rFonts w:ascii="Times New Roman" w:hAnsi="Times New Roman" w:cs="Times New Roman"/>
@@ -45303,7 +45303,7 @@
           <w:szCs w:val="36"/>
         </w:rPr>
       </w:pPr>
-      <w:bookmarkStart w:id="18" w:name="_Toc223944575"/>
+      <w:bookmarkStart w:id="18" w:name="_Toc223945574"/>
       <w:r>
         <w:rPr>
           <w:rFonts w:ascii="Times New Roman" w:hAnsi="Times New Roman" w:cs="Times New Roman"/>
@@ -47035,7 +47035,7 @@
           <w:szCs w:val="28"/>
         </w:rPr>
       </w:pPr>
-      <w:bookmarkStart w:id="19" w:name="_Toc223944576"/>
+      <w:bookmarkStart w:id="19" w:name="_Toc223945575"/>
       <w:r>
         <w:rPr>
           <w:rFonts w:ascii="Times New Roman" w:hAnsi="Times New Roman" w:cs="Times New Roman"/>
@@ -47117,20 +47117,13 @@
           <w:rFonts w:ascii="Times New Roman" w:hAnsi="Times New Roman" w:cs="Times New Roman"/>
           <w:sz w:val="24"/>
         </w:rPr>
-        <w:instrText xml:space="preserve"> REF _Ref223943834 \h </w:instrText>
-      </w:r>
-      <w:r>
-        <w:rPr>
-          <w:rFonts w:ascii="Times New Roman" w:hAnsi="Times New Roman" w:cs="Times New Roman"/>
-          <w:sz w:val="24"/>
-        </w:rPr>
-      </w:r>
-      <w:r>
-        <w:rPr>
-          <w:rFonts w:ascii="Times New Roman" w:hAnsi="Times New Roman" w:cs="Times New Roman"/>
-          <w:sz w:val="24"/>
-        </w:rPr>
-        <w:instrText xml:space="preserve"> \* MERGEFORMAT </w:instrText>
+        <w:instrText xml:space="preserve"> REF _Ref223943834 \h  \* MERGEFORMAT </w:instrText>
+      </w:r>
+      <w:r>
+        <w:rPr>
+          <w:rFonts w:ascii="Times New Roman" w:hAnsi="Times New Roman" w:cs="Times New Roman"/>
+          <w:sz w:val="24"/>
+        </w:rPr>
       </w:r>
       <w:r>
         <w:rPr>
@@ -49645,20 +49638,13 @@
           <w:rFonts w:ascii="Times New Roman" w:hAnsi="Times New Roman" w:cs="Times New Roman"/>
           <w:sz w:val="24"/>
         </w:rPr>
-        <w:instrText xml:space="preserve"> REF _Ref223944065 \h </w:instrText>
-      </w:r>
-      <w:r>
-        <w:rPr>
-          <w:rFonts w:ascii="Times New Roman" w:hAnsi="Times New Roman" w:cs="Times New Roman"/>
-          <w:sz w:val="24"/>
-        </w:rPr>
-      </w:r>
-      <w:r>
-        <w:rPr>
-          <w:rFonts w:ascii="Times New Roman" w:hAnsi="Times New Roman" w:cs="Times New Roman"/>
-          <w:sz w:val="24"/>
-        </w:rPr>
-        <w:instrText xml:space="preserve"> \* MERGEFORMAT </w:instrText>
+        <w:instrText xml:space="preserve"> REF _Ref223944065 \h  \* MERGEFORMAT </w:instrText>
+      </w:r>
+      <w:r>
+        <w:rPr>
+          <w:rFonts w:ascii="Times New Roman" w:hAnsi="Times New Roman" w:cs="Times New Roman"/>
+          <w:sz w:val="24"/>
+        </w:rPr>
       </w:r>
       <w:r>
         <w:rPr>
@@ -49672,7 +49658,21 @@
           <w:rFonts w:ascii="Times New Roman" w:hAnsi="Times New Roman" w:cs="Times New Roman"/>
           <w:sz w:val="24"/>
         </w:rPr>
-        <w:t xml:space="preserve">3.2. Evenimente și </w:t>
+        <w:t>3.2. E</w:t>
+      </w:r>
+      <w:r>
+        <w:rPr>
+          <w:rFonts w:ascii="Times New Roman" w:hAnsi="Times New Roman" w:cs="Times New Roman"/>
+          <w:sz w:val="24"/>
+        </w:rPr>
+        <w:t>v</w:t>
+      </w:r>
+      <w:r>
+        <w:rPr>
+          <w:rFonts w:ascii="Times New Roman" w:hAnsi="Times New Roman" w:cs="Times New Roman"/>
+          <w:sz w:val="24"/>
+        </w:rPr>
+        <w:t xml:space="preserve">enimente și </w:t>
       </w:r>
       <w:proofErr w:type="spellStart"/>
       <w:r>
@@ -49756,7 +49756,7 @@
           <w:szCs w:val="28"/>
         </w:rPr>
       </w:pPr>
-      <w:bookmarkStart w:id="20" w:name="_Toc223944577"/>
+      <w:bookmarkStart w:id="20" w:name="_Toc223945576"/>
       <w:r>
         <w:rPr>
           <w:rFonts w:ascii="Times New Roman" w:hAnsi="Times New Roman" w:cs="Times New Roman"/>
@@ -49813,7 +49813,7 @@
           <w:szCs w:val="28"/>
         </w:rPr>
       </w:pPr>
-      <w:bookmarkStart w:id="21" w:name="_Toc223944578"/>
+      <w:bookmarkStart w:id="21" w:name="_Toc223945577"/>
       <w:r>
         <w:rPr>
           <w:rFonts w:ascii="Times New Roman" w:hAnsi="Times New Roman" w:cs="Times New Roman"/>
@@ -49832,7 +49832,7 @@
           <w:sz w:val="28"/>
           <w:szCs w:val="28"/>
         </w:rPr>
-        <w:t xml:space="preserve"> (flux de date (browser -&gt; esp32 -&gt; </w:t>
+        <w:t xml:space="preserve"> (flux de date (</w:t>
       </w:r>
       <w:proofErr w:type="spellStart"/>
       <w:r>
@@ -49843,7 +49843,7 @@
           <w:sz w:val="28"/>
           <w:szCs w:val="28"/>
         </w:rPr>
-        <w:t>servo</w:t>
+        <w:t>user</w:t>
       </w:r>
       <w:proofErr w:type="spellEnd"/>
       <w:r>
@@ -49854,7 +49854,17 @@
           <w:sz w:val="28"/>
           <w:szCs w:val="28"/>
         </w:rPr>
-        <w:t>))</w:t>
+        <w:t xml:space="preserve"> -&gt; </w:t>
+      </w:r>
+      <w:r>
+        <w:rPr>
+          <w:rFonts w:ascii="Times New Roman" w:hAnsi="Times New Roman" w:cs="Times New Roman"/>
+          <w:b/>
+          <w:bCs/>
+          <w:sz w:val="28"/>
+          <w:szCs w:val="28"/>
+        </w:rPr>
+        <w:t>browser -&gt; esp32 -&gt; servo))</w:t>
       </w:r>
       <w:bookmarkEnd w:id="21"/>
     </w:p>
@@ -49935,7 +49945,7 @@
           <w:szCs w:val="36"/>
         </w:rPr>
       </w:pPr>
-      <w:bookmarkStart w:id="22" w:name="_Toc223944579"/>
+      <w:bookmarkStart w:id="22" w:name="_Toc223945578"/>
       <w:r>
         <w:rPr>
           <w:rFonts w:ascii="Times New Roman" w:hAnsi="Times New Roman" w:cs="Times New Roman"/>
@@ -49981,7 +49991,7 @@
           <w:szCs w:val="36"/>
         </w:rPr>
       </w:pPr>
-      <w:bookmarkStart w:id="23" w:name="_Toc223944580"/>
+      <w:bookmarkStart w:id="23" w:name="_Toc223945579"/>
       <w:r>
         <w:rPr>
           <w:rFonts w:ascii="Times New Roman" w:hAnsi="Times New Roman" w:cs="Times New Roman"/>
@@ -50027,7 +50037,7 @@
           <w:szCs w:val="28"/>
         </w:rPr>
       </w:pPr>
-      <w:bookmarkStart w:id="24" w:name="_Toc223944581"/>
+      <w:bookmarkStart w:id="24" w:name="_Toc223945580"/>
       <w:r>
         <w:rPr>
           <w:rFonts w:ascii="Times New Roman" w:hAnsi="Times New Roman" w:cs="Times New Roman"/>
@@ -50072,7 +50082,7 @@
           <w:szCs w:val="28"/>
         </w:rPr>
       </w:pPr>
-      <w:bookmarkStart w:id="25" w:name="_Toc223944582"/>
+      <w:bookmarkStart w:id="25" w:name="_Toc223945581"/>
       <w:r>
         <w:rPr>
           <w:rFonts w:ascii="Times New Roman" w:hAnsi="Times New Roman" w:cs="Times New Roman"/>
@@ -50107,7 +50117,7 @@
           <w:szCs w:val="28"/>
         </w:rPr>
       </w:pPr>
-      <w:bookmarkStart w:id="26" w:name="_Toc223944583"/>
+      <w:bookmarkStart w:id="26" w:name="_Toc223945582"/>
       <w:r>
         <w:rPr>
           <w:rFonts w:ascii="Times New Roman" w:hAnsi="Times New Roman" w:cs="Times New Roman"/>
@@ -50143,7 +50153,7 @@
           <w:lang w:val="en-US"/>
         </w:rPr>
       </w:pPr>
-      <w:bookmarkStart w:id="27" w:name="_Toc223944584"/>
+      <w:bookmarkStart w:id="27" w:name="_Toc223945583"/>
       <w:r>
         <w:rPr>
           <w:rFonts w:ascii="Times New Roman" w:hAnsi="Times New Roman" w:cs="Times New Roman"/>
@@ -50252,7 +50262,7 @@
           <w:szCs w:val="28"/>
         </w:rPr>
       </w:pPr>
-      <w:bookmarkStart w:id="28" w:name="_Toc223944585"/>
+      <w:bookmarkStart w:id="28" w:name="_Toc223945584"/>
       <w:r>
         <w:rPr>
           <w:rFonts w:ascii="Times New Roman" w:hAnsi="Times New Roman" w:cs="Times New Roman"/>
@@ -50593,7 +50603,7 @@
           <w:szCs w:val="36"/>
         </w:rPr>
       </w:pPr>
-      <w:bookmarkStart w:id="29" w:name="_Toc223944586"/>
+      <w:bookmarkStart w:id="29" w:name="_Toc223945585"/>
       <w:proofErr w:type="spellStart"/>
       <w:r>
         <w:rPr>
@@ -50665,7 +50675,7 @@
           <w:szCs w:val="28"/>
         </w:rPr>
       </w:pPr>
-      <w:bookmarkStart w:id="30" w:name="_Toc223944587"/>
+      <w:bookmarkStart w:id="30" w:name="_Toc223945586"/>
       <w:r>
         <w:rPr>
           <w:rFonts w:ascii="Times New Roman" w:hAnsi="Times New Roman" w:cs="Times New Roman"/>
@@ -50700,7 +50710,7 @@
           <w:szCs w:val="28"/>
         </w:rPr>
       </w:pPr>
-      <w:bookmarkStart w:id="31" w:name="_Toc223944588"/>
+      <w:bookmarkStart w:id="31" w:name="_Toc223945587"/>
       <w:r>
         <w:rPr>
           <w:rFonts w:ascii="Times New Roman" w:hAnsi="Times New Roman" w:cs="Times New Roman"/>
@@ -50904,7 +50914,7 @@
           <w:szCs w:val="36"/>
         </w:rPr>
       </w:pPr>
-      <w:bookmarkStart w:id="32" w:name="_Toc223944589"/>
+      <w:bookmarkStart w:id="32" w:name="_Toc223945588"/>
       <w:r>
         <w:rPr>
           <w:rFonts w:ascii="Times New Roman" w:hAnsi="Times New Roman" w:cs="Times New Roman"/>
@@ -51039,7 +51049,7 @@
         <w:spacing w:after="311" w:line="312" w:lineRule="auto"/>
         <w:ind w:left="-5"/>
       </w:pPr>
-      <w:bookmarkStart w:id="33" w:name="_Toc223944590"/>
+      <w:bookmarkStart w:id="33" w:name="_Toc223945589"/>
       <w:r>
         <w:rPr>
           <w:rFonts w:ascii="Times New Roman" w:hAnsi="Times New Roman" w:cs="Times New Roman"/>
@@ -52300,7 +52310,7 @@
         <w:spacing w:after="311" w:line="312" w:lineRule="auto"/>
         <w:ind w:left="-5"/>
       </w:pPr>
-      <w:bookmarkStart w:id="42" w:name="_Toc223944591"/>
+      <w:bookmarkStart w:id="42" w:name="_Toc223945590"/>
       <w:r>
         <w:rPr>
           <w:rFonts w:ascii="Times New Roman" w:hAnsi="Times New Roman" w:cs="Times New Roman"/>
@@ -54327,6 +54337,7 @@
   <w:style w:type="character" w:default="1" w:styleId="DefaultParagraphFont">
     <w:name w:val="Default Paragraph Font"/>
     <w:uiPriority w:val="1"/>
+    <w:semiHidden/>
     <w:unhideWhenUsed/>
   </w:style>
   <w:style w:type="table" w:default="1" w:styleId="TableNormal">

</xml_diff>